<commit_message>
update resume; reactivate github actions, update project, add papersy as new project
</commit_message>
<xml_diff>
--- a/resume.docx
+++ b/resume.docx
@@ -157,8 +157,23 @@
           <w:szCs w:val="24"/>
           <w:u w:val="none"/>
         </w:rPr>
-        <w:t>Software Developer</w:t>
-      </w:r>
+        <w:t xml:space="preserve">Software </w:t>
+      </w:r>
+      <w:bookmarkStart w:id="4" w:name="__DdeLink__148_2393250781"/>
+      <w:r>
+        <w:rPr>
+          <w:rStyle w:val="Hyperlink"/>
+          <w:rFonts w:cs="Times New Roman" w:ascii="Times New Roman" w:hAnsi="Times New Roman"/>
+          <w:b/>
+          <w:bCs/>
+          <w:color w:val="000000"/>
+          <w:sz w:val="24"/>
+          <w:szCs w:val="24"/>
+          <w:u w:val="none"/>
+        </w:rPr>
+        <w:t>Engineer</w:t>
+      </w:r>
+      <w:bookmarkEnd w:id="4"/>
       <w:r>
         <w:rPr>
           <w:rFonts w:cs="Times New Roman" w:ascii="Times New Roman" w:hAnsi="Times New Roman"/>
@@ -240,16 +255,35 @@
           <w:sz w:val="24"/>
           <w:szCs w:val="24"/>
         </w:rPr>
-        <w:t>over 150,000 users with 1.5 million clicks</w:t>
-      </w:r>
-      <w:r>
-        <w:rPr>
-          <w:rFonts w:cs="Times New Roman" w:ascii="Times New Roman" w:hAnsi="Times New Roman"/>
-          <w:color w:val="auto"/>
-          <w:sz w:val="24"/>
-          <w:szCs w:val="24"/>
-        </w:rPr>
-        <w:t xml:space="preserve"> annually.</w:t>
+        <w:t>over 150,000 users with 1.5 million requests</w:t>
+      </w:r>
+      <w:r>
+        <w:rPr>
+          <w:rFonts w:cs="Times New Roman" w:ascii="Times New Roman" w:hAnsi="Times New Roman"/>
+          <w:color w:val="auto"/>
+          <w:sz w:val="24"/>
+          <w:szCs w:val="24"/>
+        </w:rPr>
+        <w:t xml:space="preserve"> using </w:t>
+      </w:r>
+      <w:r>
+        <w:rPr>
+          <w:rStyle w:val="Strong"/>
+          <w:rFonts w:cs="Times New Roman" w:ascii="Times New Roman" w:hAnsi="Times New Roman"/>
+          <w:color w:val="auto"/>
+          <w:sz w:val="24"/>
+          <w:szCs w:val="24"/>
+        </w:rPr>
+        <w:t>PHP, React, jQuery, Leaflet, MySQL</w:t>
+      </w:r>
+      <w:r>
+        <w:rPr>
+          <w:rFonts w:cs="Times New Roman" w:ascii="Times New Roman" w:hAnsi="Times New Roman"/>
+          <w:color w:val="auto"/>
+          <w:sz w:val="24"/>
+          <w:szCs w:val="24"/>
+        </w:rPr>
+        <w:t>.</w:t>
       </w:r>
     </w:p>
     <w:p>
@@ -271,14 +305,13 @@
       </w:pPr>
       <w:r>
         <w:rPr>
+          <w:rStyle w:val="Strong"/>
           <w:rFonts w:eastAsia="Calibri" w:cs="Times New Roman" w:ascii="Times New Roman" w:hAnsi="Times New Roman"/>
-          <w:b/>
-          <w:bCs/>
-          <w:color w:val="auto"/>
-          <w:sz w:val="24"/>
-          <w:szCs w:val="24"/>
-        </w:rPr>
-        <w:t>Optimized</w:t>
+          <w:color w:val="auto"/>
+          <w:sz w:val="24"/>
+          <w:szCs w:val="24"/>
+        </w:rPr>
+        <w:t>Reduced</w:t>
       </w:r>
       <w:r>
         <w:rPr>
@@ -287,7 +320,7 @@
           <w:sz w:val="24"/>
           <w:szCs w:val="24"/>
         </w:rPr>
-        <w:t xml:space="preserve"> ingestion pipeline, reducing processing time </w:t>
+        <w:t xml:space="preserve"> ingestion pipeline processing time </w:t>
       </w:r>
       <w:r>
         <w:rPr>
@@ -368,14 +401,13 @@
       </w:pPr>
       <w:r>
         <w:rPr>
+          <w:rStyle w:val="Strong"/>
           <w:rFonts w:eastAsia="Calibri" w:cs="Times New Roman" w:ascii="Times New Roman" w:hAnsi="Times New Roman"/>
-          <w:b/>
-          <w:bCs/>
-          <w:color w:val="auto"/>
-          <w:sz w:val="24"/>
-          <w:szCs w:val="24"/>
-        </w:rPr>
-        <w:t>Resolved</w:t>
+          <w:color w:val="auto"/>
+          <w:sz w:val="24"/>
+          <w:szCs w:val="24"/>
+        </w:rPr>
+        <w:t>Adopted Claude Code, Docker, GitHub Actions</w:t>
       </w:r>
       <w:r>
         <w:rPr>
@@ -384,7 +416,7 @@
           <w:sz w:val="24"/>
           <w:szCs w:val="24"/>
         </w:rPr>
-        <w:t xml:space="preserve"> critical issues in the database management tool, enhancing its stability and functionality to support efficient data maintenance.</w:t>
+        <w:t xml:space="preserve"> to automate development, testing and deployment of platform, reducing cost by 70%.</w:t>
       </w:r>
     </w:p>
     <w:p>
@@ -485,7 +517,26 @@
           <w:sz w:val="24"/>
           <w:szCs w:val="24"/>
         </w:rPr>
-        <w:t xml:space="preserve"> the portal for educators and school districts, ensuring seamless access to outdoor education resources and reporting systems.</w:t>
+        <w:t xml:space="preserve"> the portal for educators and school districts using </w:t>
+      </w:r>
+      <w:r>
+        <w:rPr>
+          <w:rStyle w:val="Strong"/>
+          <w:rFonts w:cs="Times New Roman" w:ascii="Times New Roman" w:hAnsi="Times New Roman"/>
+          <w:color w:val="auto"/>
+          <w:sz w:val="24"/>
+          <w:szCs w:val="24"/>
+        </w:rPr>
+        <w:t>Drupal (PHP)</w:t>
+      </w:r>
+      <w:r>
+        <w:rPr>
+          <w:rFonts w:cs="Times New Roman" w:ascii="Times New Roman" w:hAnsi="Times New Roman"/>
+          <w:color w:val="auto"/>
+          <w:sz w:val="24"/>
+          <w:szCs w:val="24"/>
+        </w:rPr>
+        <w:t>, ensuring seamless access to outdoor education resources and reporting systems.</w:t>
       </w:r>
     </w:p>
     <w:p>
@@ -510,7 +561,20 @@
           <w:sz w:val="24"/>
           <w:szCs w:val="24"/>
         </w:rPr>
-        <w:t>Software Developer</w:t>
+        <w:t xml:space="preserve">Software </w:t>
+      </w:r>
+      <w:r>
+        <w:rPr>
+          <w:rStyle w:val="Hyperlink"/>
+          <w:rFonts w:cs="Times New Roman" w:ascii="Times New Roman" w:hAnsi="Times New Roman"/>
+          <w:b/>
+          <w:bCs/>
+          <w:color w:val="000000"/>
+          <w:sz w:val="24"/>
+          <w:szCs w:val="24"/>
+          <w:u w:val="none"/>
+        </w:rPr>
+        <w:t>Engineer</w:t>
       </w:r>
       <w:r>
         <w:rPr>
@@ -573,7 +637,7 @@
         </w:rPr>
         <w:t xml:space="preserve"> </w:t>
       </w:r>
-      <w:bookmarkStart w:id="4" w:name="__DdeLink__117_255574347"/>
+      <w:bookmarkStart w:id="5" w:name="__DdeLink__117_255574347"/>
       <w:r>
         <w:rPr>
           <w:rFonts w:cs="Times New Roman" w:ascii="Times New Roman" w:hAnsi="Times New Roman"/>
@@ -582,7 +646,7 @@
         </w:rPr>
         <w:t>Ho Chi Minh C</w:t>
       </w:r>
-      <w:bookmarkEnd w:id="4"/>
+      <w:bookmarkEnd w:id="5"/>
       <w:r>
         <w:rPr>
           <w:rFonts w:cs="Times New Roman" w:ascii="Times New Roman" w:hAnsi="Times New Roman"/>
@@ -627,18 +691,27 @@
           <w:sz w:val="24"/>
           <w:szCs w:val="24"/>
         </w:rPr>
-        <w:t xml:space="preserve"> a business-to-business distribution management system, ensuring </w:t>
-      </w:r>
-      <w:r>
-        <w:rPr>
-          <w:rFonts w:cs="Times New Roman" w:ascii="Times New Roman" w:hAnsi="Times New Roman"/>
-          <w:b/>
-          <w:bCs/>
-          <w:color w:val="auto"/>
-          <w:sz w:val="24"/>
-          <w:szCs w:val="24"/>
-        </w:rPr>
-        <w:t>accurate</w:t>
+        <w:t xml:space="preserve"> a high-throughput </w:t>
+      </w:r>
+      <w:r>
+        <w:rPr>
+          <w:rFonts w:cs="Times New Roman" w:ascii="Times New Roman" w:hAnsi="Times New Roman"/>
+          <w:b/>
+          <w:bCs/>
+          <w:color w:val="auto"/>
+          <w:sz w:val="24"/>
+          <w:szCs w:val="24"/>
+        </w:rPr>
+        <w:t>B2B</w:t>
+      </w:r>
+      <w:r>
+        <w:rPr>
+          <w:rFonts w:cs="Times New Roman" w:ascii="Times New Roman" w:hAnsi="Times New Roman"/>
+          <w:color w:val="auto"/>
+          <w:sz w:val="24"/>
+          <w:szCs w:val="24"/>
+        </w:rPr>
+        <w:t xml:space="preserve"> distribution management system using </w:t>
       </w:r>
       <w:r>
         <w:rPr>
@@ -648,16 +721,7 @@
           <w:sz w:val="24"/>
           <w:szCs w:val="24"/>
         </w:rPr>
-        <w:t xml:space="preserve"> calculation</w:t>
-      </w:r>
-      <w:r>
-        <w:rPr>
-          <w:rFonts w:cs="Times New Roman" w:ascii="Times New Roman" w:hAnsi="Times New Roman"/>
-          <w:color w:val="auto"/>
-          <w:sz w:val="24"/>
-          <w:szCs w:val="24"/>
-        </w:rPr>
-        <w:t xml:space="preserve"> for high-volume operations.</w:t>
+        <w:t>.NET (C#), Vue, Typescript, PostgreSQL, Microservices, Redis, Kubernetes.</w:t>
       </w:r>
     </w:p>
     <w:p>
@@ -753,26 +817,6 @@
           <w:sz w:val="24"/>
           <w:szCs w:val="24"/>
         </w:rPr>
-        <w:t xml:space="preserve"> and </w:t>
-      </w:r>
-      <w:r>
-        <w:rPr>
-          <w:rFonts w:cs="Times New Roman" w:ascii="Times New Roman" w:hAnsi="Times New Roman"/>
-          <w:b/>
-          <w:bCs/>
-          <w:color w:val="auto"/>
-          <w:sz w:val="24"/>
-          <w:szCs w:val="24"/>
-        </w:rPr>
-        <w:t>deployed</w:t>
-      </w:r>
-      <w:r>
-        <w:rPr>
-          <w:rFonts w:cs="Times New Roman" w:ascii="Times New Roman" w:hAnsi="Times New Roman"/>
-          <w:color w:val="auto"/>
-          <w:sz w:val="24"/>
-          <w:szCs w:val="24"/>
-        </w:rPr>
         <w:t xml:space="preserve"> An Sinh, a </w:t>
       </w:r>
       <w:r>
@@ -815,8 +859,8 @@
         </w:rPr>
         <w:t xml:space="preserve"> during COVID-19 in Ho Chi Minh City.</w:t>
       </w:r>
-      <w:bookmarkStart w:id="5" w:name="__DdeLink__100_1413304929"/>
       <w:bookmarkStart w:id="6" w:name="__DdeLink__95_1413304929"/>
+      <w:bookmarkStart w:id="7" w:name="__DdeLink__100_1413304929"/>
     </w:p>
     <w:p>
       <w:pPr>
@@ -1057,7 +1101,7 @@
           <w:szCs w:val="24"/>
         </w:rPr>
       </w:pPr>
-      <w:bookmarkStart w:id="7" w:name="__DdeLink__451_2990111394"/>
+      <w:bookmarkStart w:id="8" w:name="__DdeLink__451_2990111394"/>
       <w:r>
         <w:rPr>
           <w:rFonts w:cs="Times New Roman" w:ascii="Times New Roman" w:hAnsi="Times New Roman"/>
@@ -1068,7 +1112,7 @@
         </w:rPr>
         <w:t>PROJECTS</w:t>
       </w:r>
-      <w:bookmarkEnd w:id="7"/>
+      <w:bookmarkEnd w:id="8"/>
     </w:p>
     <w:p>
       <w:pPr>
@@ -1077,12 +1121,9 @@
           <w:tab w:val="clear" w:pos="720"/>
           <w:tab w:val="right" w:pos="9360" w:leader="none"/>
         </w:tabs>
-        <w:spacing w:lineRule="auto" w:line="240" w:before="0" w:after="120"/>
-        <w:rPr>
-          <w:rFonts w:ascii="Times New Roman" w:hAnsi="Times New Roman" w:cs="Times New Roman"/>
-          <w:sz w:val="24"/>
-          <w:szCs w:val="24"/>
-        </w:rPr>
+        <w:spacing w:lineRule="auto" w:line="240" w:before="0" w:after="86"/>
+        <w:ind w:hanging="360" w:left="360"/>
+        <w:rPr/>
       </w:pPr>
       <w:hyperlink r:id="rId6">
         <w:r>
@@ -1094,9 +1135,10 @@
             <w:sz w:val="24"/>
             <w:szCs w:val="24"/>
           </w:rPr>
-          <w:t>OCR AI Web</w:t>
+          <w:t>Papersy</w:t>
         </w:r>
       </w:hyperlink>
+      <w:bookmarkStart w:id="9" w:name="__DdeLink__159_942073057"/>
     </w:p>
     <w:p>
       <w:pPr>
@@ -1111,30 +1153,129 @@
         </w:tabs>
         <w:spacing w:lineRule="auto" w:line="240" w:before="0" w:after="86"/>
         <w:ind w:hanging="360" w:left="360"/>
-        <w:rPr>
-          <w:rFonts w:ascii="Times New Roman" w:hAnsi="Times New Roman" w:cs="Times New Roman"/>
-          <w:sz w:val="24"/>
-          <w:szCs w:val="24"/>
-        </w:rPr>
-      </w:pPr>
-      <w:r>
-        <w:rPr>
-          <w:rFonts w:cs="Times New Roman" w:ascii="Times New Roman" w:hAnsi="Times New Roman"/>
-          <w:b/>
-          <w:bCs/>
-          <w:sz w:val="24"/>
-          <w:szCs w:val="24"/>
-        </w:rPr>
-        <w:t>Designed</w:t>
-      </w:r>
-      <w:r>
-        <w:rPr>
-          <w:rFonts w:cs="Times New Roman" w:ascii="Times New Roman" w:hAnsi="Times New Roman"/>
-          <w:sz w:val="24"/>
-          <w:szCs w:val="24"/>
-        </w:rPr>
-        <w:t xml:space="preserve"> an AI document scanner that utilize LightOnOCR to transcribe image to text.</w:t>
-      </w:r>
+        <w:rPr/>
+      </w:pPr>
+      <w:bookmarkStart w:id="10" w:name="__DdeLink__432_4034219878"/>
+      <w:r>
+        <w:rPr>
+          <w:rStyle w:val="Hyperlink"/>
+          <w:rFonts w:cs="Times New Roman" w:ascii="Times New Roman" w:hAnsi="Times New Roman"/>
+          <w:b/>
+          <w:bCs/>
+          <w:color w:val="auto"/>
+          <w:sz w:val="24"/>
+          <w:szCs w:val="24"/>
+          <w:u w:val="none"/>
+        </w:rPr>
+        <w:t>Built</w:t>
+      </w:r>
+      <w:r>
+        <w:rPr>
+          <w:rStyle w:val="Hyperlink"/>
+          <w:rFonts w:cs="Times New Roman" w:ascii="Times New Roman" w:hAnsi="Times New Roman"/>
+          <w:b w:val="false"/>
+          <w:bCs w:val="false"/>
+          <w:color w:val="auto"/>
+          <w:sz w:val="24"/>
+          <w:szCs w:val="24"/>
+          <w:u w:val="none"/>
+        </w:rPr>
+        <w:t xml:space="preserve"> an </w:t>
+      </w:r>
+      <w:r>
+        <w:rPr>
+          <w:rStyle w:val="Hyperlink"/>
+          <w:rFonts w:cs="Times New Roman" w:ascii="Times New Roman" w:hAnsi="Times New Roman"/>
+          <w:b/>
+          <w:bCs/>
+          <w:color w:val="auto"/>
+          <w:sz w:val="24"/>
+          <w:szCs w:val="24"/>
+          <w:u w:val="none"/>
+        </w:rPr>
+        <w:t>agentic AI</w:t>
+      </w:r>
+      <w:r>
+        <w:rPr>
+          <w:rStyle w:val="Hyperlink"/>
+          <w:rFonts w:cs="Times New Roman" w:ascii="Times New Roman" w:hAnsi="Times New Roman"/>
+          <w:b w:val="false"/>
+          <w:bCs w:val="false"/>
+          <w:color w:val="auto"/>
+          <w:sz w:val="24"/>
+          <w:szCs w:val="24"/>
+          <w:u w:val="none"/>
+        </w:rPr>
+        <w:t xml:space="preserve"> research assistant with </w:t>
+      </w:r>
+      <w:r>
+        <w:rPr>
+          <w:rStyle w:val="Hyperlink"/>
+          <w:rFonts w:cs="Times New Roman" w:ascii="Times New Roman" w:hAnsi="Times New Roman"/>
+          <w:b/>
+          <w:bCs/>
+          <w:color w:val="auto"/>
+          <w:sz w:val="24"/>
+          <w:szCs w:val="24"/>
+          <w:u w:val="none"/>
+        </w:rPr>
+        <w:t>RAG</w:t>
+      </w:r>
+      <w:bookmarkStart w:id="11" w:name="__DdeLink__374_4023190652"/>
+      <w:bookmarkEnd w:id="11"/>
+      <w:r>
+        <w:rPr>
+          <w:rStyle w:val="Hyperlink"/>
+          <w:rFonts w:cs="Times New Roman" w:ascii="Times New Roman" w:hAnsi="Times New Roman"/>
+          <w:b/>
+          <w:bCs/>
+          <w:color w:val="auto"/>
+          <w:sz w:val="24"/>
+          <w:szCs w:val="24"/>
+          <w:u w:val="none"/>
+        </w:rPr>
+        <w:t>, OpenAI,</w:t>
+      </w:r>
+      <w:r>
+        <w:rPr>
+          <w:rStyle w:val="Hyperlink"/>
+          <w:rFonts w:cs="Times New Roman" w:ascii="Times New Roman" w:hAnsi="Times New Roman"/>
+          <w:b w:val="false"/>
+          <w:bCs w:val="false"/>
+          <w:color w:val="auto"/>
+          <w:sz w:val="24"/>
+          <w:szCs w:val="24"/>
+          <w:u w:val="none"/>
+        </w:rPr>
+        <w:t xml:space="preserve"> </w:t>
+      </w:r>
+      <w:r>
+        <w:rPr>
+          <w:rStyle w:val="Hyperlink"/>
+          <w:rFonts w:cs="Times New Roman" w:ascii="Times New Roman" w:hAnsi="Times New Roman"/>
+          <w:b/>
+          <w:bCs/>
+          <w:color w:val="auto"/>
+          <w:sz w:val="24"/>
+          <w:szCs w:val="24"/>
+          <w:u w:val="none"/>
+        </w:rPr>
+        <w:t>LangChain, pgvector</w:t>
+      </w:r>
+      <w:r>
+        <w:rPr>
+          <w:rStyle w:val="Hyperlink"/>
+          <w:rFonts w:cs="Times New Roman" w:ascii="Times New Roman" w:hAnsi="Times New Roman"/>
+          <w:b w:val="false"/>
+          <w:bCs w:val="false"/>
+          <w:sz w:val="24"/>
+          <w:szCs w:val="24"/>
+          <w:u w:val="none"/>
+        </w:rPr>
+        <w:t>.</w:t>
+      </w:r>
+      <w:bookmarkEnd w:id="9"/>
+      <w:bookmarkEnd w:id="10"/>
     </w:p>
     <w:p>
       <w:pPr>
@@ -1151,7 +1292,7 @@
         </w:rPr>
       </w:pPr>
       <w:hyperlink r:id="rId7">
-        <w:bookmarkStart w:id="8" w:name="__DdeLink__114_2555743471"/>
+        <w:bookmarkStart w:id="12" w:name="__DdeLink__114_2555743471"/>
         <w:r>
           <w:rPr>
             <w:rStyle w:val="Hyperlink"/>
@@ -1164,7 +1305,7 @@
           <w:t>Object Detection and Monitoring through UAV</w:t>
         </w:r>
       </w:hyperlink>
-      <w:bookmarkEnd w:id="8"/>
+      <w:bookmarkEnd w:id="12"/>
       <w:r>
         <w:rPr>
           <w:rFonts w:cs="Times New Roman" w:ascii="Times New Roman" w:hAnsi="Times New Roman"/>
@@ -1279,7 +1420,31 @@
           <w:szCs w:val="24"/>
           <w:u w:val="none"/>
         </w:rPr>
-        <w:t xml:space="preserve"> a drone capable of identifying, following targets and transmitting live video.</w:t>
+        <w:t xml:space="preserve"> a drone capable of identifying, following targets using </w:t>
+      </w:r>
+      <w:r>
+        <w:rPr>
+          <w:rStyle w:val="Hyperlink"/>
+          <w:rFonts w:cs="Times New Roman" w:ascii="Times New Roman" w:hAnsi="Times New Roman"/>
+          <w:b/>
+          <w:bCs/>
+          <w:color w:val="auto"/>
+          <w:sz w:val="24"/>
+          <w:szCs w:val="24"/>
+          <w:u w:val="none"/>
+        </w:rPr>
+        <w:t>OpenCV, Tensorflor</w:t>
+      </w:r>
+      <w:r>
+        <w:rPr>
+          <w:rStyle w:val="Hyperlink"/>
+          <w:rFonts w:cs="Times New Roman" w:ascii="Times New Roman" w:hAnsi="Times New Roman"/>
+          <w:color w:val="auto"/>
+          <w:sz w:val="24"/>
+          <w:szCs w:val="24"/>
+          <w:u w:val="none"/>
+        </w:rPr>
+        <w:t>.</w:t>
       </w:r>
     </w:p>
     <w:p>
@@ -1297,7 +1462,7 @@
           <w:szCs w:val="24"/>
         </w:rPr>
       </w:pPr>
-      <w:bookmarkStart w:id="9" w:name="__DdeLink__65_622835337"/>
+      <w:bookmarkStart w:id="13" w:name="__DdeLink__65_622835337"/>
       <w:r>
         <w:rPr>
           <w:rFonts w:cs="Times New Roman" w:ascii="Times New Roman" w:hAnsi="Times New Roman"/>
@@ -1308,9 +1473,9 @@
         </w:rPr>
         <w:t>SKILLS</w:t>
       </w:r>
-      <w:bookmarkEnd w:id="5"/>
       <w:bookmarkEnd w:id="6"/>
-      <w:bookmarkEnd w:id="9"/>
+      <w:bookmarkEnd w:id="7"/>
+      <w:bookmarkEnd w:id="13"/>
     </w:p>
     <w:p>
       <w:pPr>
@@ -1327,7 +1492,6 @@
           <w:szCs w:val="24"/>
         </w:rPr>
       </w:pPr>
-      <w:bookmarkStart w:id="10" w:name="__DdeLink__293_2421298475"/>
       <w:r>
         <w:rPr>
           <w:rFonts w:eastAsia="Calibri" w:cs="Times New Roman" w:ascii="Times New Roman" w:hAnsi="Times New Roman"/>
@@ -1486,7 +1650,7 @@
           <w:szCs w:val="24"/>
         </w:rPr>
       </w:pPr>
-      <w:bookmarkStart w:id="11" w:name="__DdeLink__293_2421298475"/>
+      <w:bookmarkStart w:id="14" w:name="__DdeLink__293_2421298475"/>
       <w:r>
         <w:rPr>
           <w:rFonts w:eastAsia="Calibri" w:cs="Times New Roman" w:ascii="Times New Roman" w:hAnsi="Times New Roman"/>
@@ -1496,7 +1660,7 @@
         </w:rPr>
         <w:t>Cloud Platforms: AWS EC2, ECS, Lambda, S3, CloudFront, RDS, DynamoDB</w:t>
       </w:r>
-      <w:bookmarkEnd w:id="11"/>
+      <w:bookmarkEnd w:id="14"/>
     </w:p>
     <w:sectPr>
       <w:type w:val="nextPage"/>
@@ -1783,7 +1947,7 @@
   <w:docDefaults>
     <w:rPrDefault>
       <w:rPr>
-        <w:rFonts w:ascii="Calibri" w:hAnsi="Calibri" w:eastAsia="Calibri" w:cs="" w:asciiTheme="minorHAnsi" w:cstheme="minorBidi" w:eastAsiaTheme="minorHAnsi" w:hAnsiTheme="minorHAnsi"/>
+        <w:rFonts w:ascii="Arial" w:hAnsi="Arial" w:eastAsia="Arial" w:cs="DejaVu Sans" w:asciiTheme="minorHAnsi" w:cstheme="minorBidi" w:eastAsiaTheme="minorHAnsi" w:hAnsiTheme="minorHAnsi"/>
         <w:kern w:val="2"/>
         <w:sz w:val="22"/>
         <w:szCs w:val="22"/>
@@ -2186,7 +2350,7 @@
       <w:jc w:val="left"/>
     </w:pPr>
     <w:rPr>
-      <w:rFonts w:ascii="Calibri" w:hAnsi="Calibri" w:eastAsia="Calibri" w:cs="" w:asciiTheme="minorHAnsi" w:cstheme="minorBidi" w:eastAsiaTheme="minorHAnsi" w:hAnsiTheme="minorHAnsi"/>
+      <w:rFonts w:ascii="Arial" w:hAnsi="Arial" w:eastAsia="Arial" w:cs="DejaVu Sans" w:asciiTheme="minorHAnsi" w:cstheme="minorBidi" w:eastAsiaTheme="minorHAnsi" w:hAnsiTheme="minorHAnsi"/>
       <w:color w:val="auto"/>
       <w:kern w:val="2"/>
       <w:sz w:val="22"/>
@@ -2211,7 +2375,7 @@
     <w:qFormat/>
     <w:rsid w:val="00e340da"/>
     <w:rPr>
-      <w:rFonts w:ascii="Calibri Light" w:hAnsi="Calibri Light" w:eastAsia="" w:cs="" w:asciiTheme="majorHAnsi" w:cstheme="majorBidi" w:eastAsiaTheme="majorEastAsia" w:hAnsiTheme="majorHAnsi"/>
+      <w:rFonts w:ascii="Arial" w:hAnsi="Arial" w:eastAsia="DejaVu Sans" w:cs="DejaVu Sans" w:asciiTheme="majorHAnsi" w:cstheme="majorBidi" w:eastAsiaTheme="majorEastAsia" w:hAnsiTheme="majorHAnsi"/>
       <w:caps/>
       <w:color w:themeColor="text1" w:themeTint="a6" w:val="595959"/>
       <w:kern w:val="2"/>
@@ -2289,6 +2453,16 @@
       <w:bCs/>
     </w:rPr>
   </w:style>
+  <w:style w:type="character" w:styleId="FootnoteCharacters">
+    <w:name w:val="Footnote Characters"/>
+    <w:qFormat/>
+    <w:rPr/>
+  </w:style>
+  <w:style w:type="character" w:styleId="EndnoteCharacters">
+    <w:name w:val="Endnote Characters"/>
+    <w:qFormat/>
+    <w:rPr/>
+  </w:style>
   <w:style w:type="paragraph" w:styleId="Heading" w:customStyle="1">
     <w:name w:val="Heading"/>
     <w:basedOn w:val="Normal"/>
@@ -2360,7 +2534,7 @@
       <w:jc w:val="center"/>
     </w:pPr>
     <w:rPr>
-      <w:rFonts w:ascii="Calibri Light" w:hAnsi="Calibri Light" w:eastAsia="" w:cs="" w:asciiTheme="majorHAnsi" w:cstheme="majorBidi" w:eastAsiaTheme="majorEastAsia" w:hAnsiTheme="majorHAnsi"/>
+      <w:rFonts w:ascii="Arial" w:hAnsi="Arial" w:eastAsia="DejaVu Sans" w:cs="DejaVu Sans" w:asciiTheme="majorHAnsi" w:cstheme="majorBidi" w:eastAsiaTheme="majorEastAsia" w:hAnsiTheme="majorHAnsi"/>
       <w:caps/>
       <w:color w:themeColor="text1" w:themeTint="a6" w:val="595959"/>
       <w:sz w:val="70"/>
@@ -2403,6 +2577,15 @@
       <w14:ligatures w14:val="none"/>
     </w:rPr>
   </w:style>
+  <w:style w:type="paragraph" w:styleId="ListContents">
+    <w:name w:val="List Contents"/>
+    <w:basedOn w:val="Normal"/>
+    <w:qFormat/>
+    <w:pPr>
+      <w:ind w:left="567"/>
+    </w:pPr>
+    <w:rPr/>
+  </w:style>
   <w:style w:type="numbering" w:styleId="NoList" w:default="1">
     <w:name w:val="No List"/>
     <w:uiPriority w:val="99"/>
@@ -2428,9 +2611,9 @@
 </file>
 
 <file path=word/theme/theme1.xml><?xml version="1.0" encoding="utf-8"?>
-<a:theme xmlns:a="http://schemas.openxmlformats.org/drawingml/2006/main" xmlns:r="http://schemas.openxmlformats.org/officeDocument/2006/relationships" name="Office Theme">
+<a:theme xmlns:a="http://schemas.openxmlformats.org/drawingml/2006/main" xmlns:r="http://schemas.openxmlformats.org/officeDocument/2006/relationships" name="Office">
   <a:themeElements>
-    <a:clrScheme name="Office">
+    <a:clrScheme name="LibreOffice">
       <a:dk1>
         <a:srgbClr val="000000"/>
       </a:dk1>
@@ -2438,46 +2621,46 @@
         <a:srgbClr val="ffffff"/>
       </a:lt1>
       <a:dk2>
-        <a:srgbClr val="44546a"/>
+        <a:srgbClr val="000000"/>
       </a:dk2>
       <a:lt2>
-        <a:srgbClr val="e7e6e6"/>
+        <a:srgbClr val="ffffff"/>
       </a:lt2>
       <a:accent1>
-        <a:srgbClr val="5b9bd5"/>
+        <a:srgbClr val="18a303"/>
       </a:accent1>
       <a:accent2>
-        <a:srgbClr val="ed7d31"/>
+        <a:srgbClr val="0369a3"/>
       </a:accent2>
       <a:accent3>
-        <a:srgbClr val="a5a5a5"/>
+        <a:srgbClr val="a33e03"/>
       </a:accent3>
       <a:accent4>
-        <a:srgbClr val="ffc000"/>
+        <a:srgbClr val="8e03a3"/>
       </a:accent4>
       <a:accent5>
-        <a:srgbClr val="4472c4"/>
+        <a:srgbClr val="c99c00"/>
       </a:accent5>
       <a:accent6>
-        <a:srgbClr val="70ad47"/>
+        <a:srgbClr val="c9211e"/>
       </a:accent6>
       <a:hlink>
-        <a:srgbClr val="0563c1"/>
+        <a:srgbClr val="0000ee"/>
       </a:hlink>
       <a:folHlink>
-        <a:srgbClr val="954f72"/>
+        <a:srgbClr val="551a8b"/>
       </a:folHlink>
     </a:clrScheme>
     <a:fontScheme name="Office">
       <a:majorFont>
-        <a:latin typeface="Calibri Light" panose="020F0302020204030204" pitchFamily="0" charset="1"/>
-        <a:ea typeface=""/>
-        <a:cs typeface=""/>
+        <a:latin typeface="Arial" pitchFamily="0" charset="1"/>
+        <a:ea typeface="DejaVu Sans" pitchFamily="0" charset="1"/>
+        <a:cs typeface="DejaVu Sans" pitchFamily="0" charset="1"/>
       </a:majorFont>
       <a:minorFont>
-        <a:latin typeface="Calibri" panose="020F0502020204030204" pitchFamily="0" charset="1"/>
-        <a:ea typeface=""/>
-        <a:cs typeface=""/>
+        <a:latin typeface="Arial" pitchFamily="0" charset="1"/>
+        <a:ea typeface="DejaVu Sans" pitchFamily="0" charset="1"/>
+        <a:cs typeface="DejaVu Sans" pitchFamily="0" charset="1"/>
       </a:minorFont>
     </a:fontScheme>
     <a:fmtScheme>
@@ -2485,67 +2668,25 @@
         <a:solidFill>
           <a:schemeClr val="phClr"/>
         </a:solidFill>
-        <a:gradFill>
-          <a:gsLst>
-            <a:gs pos="0">
-              <a:schemeClr val="phClr">
-                <a:lumMod val="110000"/>
-                <a:tint val="67000"/>
-              </a:schemeClr>
-            </a:gs>
-            <a:gs pos="50000">
-              <a:schemeClr val="phClr">
-                <a:lumMod val="105000"/>
-                <a:tint val="73000"/>
-              </a:schemeClr>
-            </a:gs>
-            <a:gs pos="100000">
-              <a:schemeClr val="phClr">
-                <a:lumMod val="105000"/>
-                <a:tint val="81000"/>
-              </a:schemeClr>
-            </a:gs>
-          </a:gsLst>
-          <a:lin ang="5400000" scaled="0"/>
-          <a:tileRect l="0" t="0" r="0" b="0"/>
-        </a:gradFill>
-        <a:gradFill>
-          <a:gsLst>
-            <a:gs pos="0">
-              <a:schemeClr val="phClr">
-                <a:lumMod val="102000"/>
-                <a:tint val="94000"/>
-              </a:schemeClr>
-            </a:gs>
-            <a:gs pos="50000">
-              <a:schemeClr val="phClr">
-                <a:lumMod val="100000"/>
-                <a:shade val="100000"/>
-              </a:schemeClr>
-            </a:gs>
-            <a:gs pos="100000">
-              <a:schemeClr val="phClr">
-                <a:lumMod val="99000"/>
-                <a:shade val="78000"/>
-              </a:schemeClr>
-            </a:gs>
-          </a:gsLst>
-          <a:lin ang="5400000" scaled="0"/>
-          <a:tileRect l="0" t="0" r="0" b="0"/>
-        </a:gradFill>
+        <a:solidFill>
+          <a:schemeClr val="phClr"/>
+        </a:solidFill>
+        <a:solidFill>
+          <a:schemeClr val="phClr"/>
+        </a:solidFill>
       </a:fillStyleLst>
       <a:lnStyleLst>
         <a:ln w="6350" cap="flat" cmpd="sng" algn="ctr">
           <a:prstDash val="solid"/>
-          <a:miter lim="800000"/>
+          <a:miter/>
         </a:ln>
-        <a:ln w="12700" cap="flat" cmpd="sng" algn="ctr">
+        <a:ln w="6350" cap="flat" cmpd="sng" algn="ctr">
           <a:prstDash val="solid"/>
-          <a:miter lim="800000"/>
+          <a:miter/>
         </a:ln>
-        <a:ln w="19050" cap="flat" cmpd="sng" algn="ctr">
+        <a:ln w="6350" cap="flat" cmpd="sng" algn="ctr">
           <a:prstDash val="solid"/>
-          <a:miter lim="800000"/>
+          <a:miter/>
         </a:ln>
       </a:lnStyleLst>
       <a:effectStyleLst>
@@ -2564,35 +2705,11 @@
           <a:schemeClr val="phClr"/>
         </a:solidFill>
         <a:solidFill>
-          <a:schemeClr val="phClr">
-            <a:tint val="95000"/>
-          </a:schemeClr>
+          <a:schemeClr val="phClr"/>
         </a:solidFill>
-        <a:gradFill>
-          <a:gsLst>
-            <a:gs pos="0">
-              <a:schemeClr val="phClr">
-                <a:tint val="93000"/>
-                <a:shade val="98000"/>
-                <a:lumMod val="102000"/>
-              </a:schemeClr>
-            </a:gs>
-            <a:gs pos="50000">
-              <a:schemeClr val="phClr">
-                <a:tint val="98000"/>
-                <a:shade val="90000"/>
-                <a:lumMod val="103000"/>
-              </a:schemeClr>
-            </a:gs>
-            <a:gs pos="100000">
-              <a:schemeClr val="phClr">
-                <a:shade val="63000"/>
-              </a:schemeClr>
-            </a:gs>
-          </a:gsLst>
-          <a:lin ang="5400000" scaled="0"/>
-          <a:tileRect l="0" t="0" r="0" b="0"/>
-        </a:gradFill>
+        <a:solidFill>
+          <a:schemeClr val="phClr"/>
+        </a:solidFill>
       </a:bgFillStyleLst>
     </a:fmtScheme>
   </a:themeElements>

</xml_diff>

<commit_message>
add autuber as new project
</commit_message>
<xml_diff>
--- a/resume.docx
+++ b/resume.docx
@@ -859,8 +859,8 @@
         </w:rPr>
         <w:t xml:space="preserve"> during COVID-19 in Ho Chi Minh City.</w:t>
       </w:r>
-      <w:bookmarkStart w:id="6" w:name="__DdeLink__100_1413304929"/>
-      <w:bookmarkStart w:id="7" w:name="__DdeLink__95_1413304929"/>
+      <w:bookmarkStart w:id="6" w:name="__DdeLink__95_1413304929"/>
+      <w:bookmarkStart w:id="7" w:name="__DdeLink__100_1413304929"/>
     </w:p>
     <w:p>
       <w:pPr>
@@ -1126,6 +1126,248 @@
         <w:rPr/>
       </w:pPr>
       <w:hyperlink r:id="rId6">
+        <w:r>
+          <w:rPr>
+            <w:rStyle w:val="Hyperlink"/>
+            <w:rFonts w:cs="Times New Roman" w:ascii="Times New Roman" w:hAnsi="Times New Roman"/>
+            <w:b/>
+            <w:bCs/>
+            <w:sz w:val="24"/>
+            <w:szCs w:val="24"/>
+          </w:rPr>
+          <w:t>AuTuber</w:t>
+        </w:r>
+      </w:hyperlink>
+      <w:bookmarkStart w:id="9" w:name="__DdeLink__159_942073057_Copy_1"/>
+    </w:p>
+    <w:p>
+      <w:pPr>
+        <w:pStyle w:val="Normal"/>
+        <w:numPr>
+          <w:ilvl w:val="0"/>
+          <w:numId w:val="1"/>
+        </w:numPr>
+        <w:tabs>
+          <w:tab w:val="clear" w:pos="720"/>
+          <w:tab w:val="right" w:pos="9360" w:leader="none"/>
+        </w:tabs>
+        <w:spacing w:lineRule="auto" w:line="240" w:before="0" w:after="86"/>
+        <w:ind w:hanging="360" w:left="360"/>
+        <w:rPr/>
+      </w:pPr>
+      <w:bookmarkStart w:id="10" w:name="__DdeLink__432_4034219878_Copy_1"/>
+      <w:r>
+        <w:rPr>
+          <w:rStyle w:val="Hyperlink"/>
+          <w:rFonts w:cs="Times New Roman" w:ascii="Times New Roman" w:hAnsi="Times New Roman"/>
+          <w:b/>
+          <w:bCs/>
+          <w:color w:val="auto"/>
+          <w:sz w:val="24"/>
+          <w:szCs w:val="24"/>
+          <w:u w:val="none"/>
+        </w:rPr>
+        <w:t>Built</w:t>
+      </w:r>
+      <w:r>
+        <w:rPr>
+          <w:rStyle w:val="Hyperlink"/>
+          <w:rFonts w:cs="Times New Roman" w:ascii="Times New Roman" w:hAnsi="Times New Roman"/>
+          <w:b w:val="false"/>
+          <w:bCs w:val="false"/>
+          <w:color w:val="auto"/>
+          <w:sz w:val="24"/>
+          <w:szCs w:val="24"/>
+          <w:u w:val="none"/>
+        </w:rPr>
+        <w:t xml:space="preserve"> an </w:t>
+      </w:r>
+      <w:r>
+        <w:rPr>
+          <w:rStyle w:val="Hyperlink"/>
+          <w:rFonts w:cs="Times New Roman" w:ascii="Times New Roman" w:hAnsi="Times New Roman"/>
+          <w:b/>
+          <w:bCs/>
+          <w:color w:val="auto"/>
+          <w:sz w:val="24"/>
+          <w:szCs w:val="24"/>
+          <w:u w:val="none"/>
+        </w:rPr>
+        <w:t xml:space="preserve">agentic </w:t>
+      </w:r>
+      <w:r>
+        <w:rPr>
+          <w:rStyle w:val="Hyperlink"/>
+          <w:rFonts w:cs="Times New Roman" w:ascii="Times New Roman" w:hAnsi="Times New Roman"/>
+          <w:b/>
+          <w:bCs/>
+          <w:color w:val="auto"/>
+          <w:sz w:val="24"/>
+          <w:szCs w:val="24"/>
+          <w:u w:val="none"/>
+        </w:rPr>
+        <w:t>AI</w:t>
+      </w:r>
+      <w:r>
+        <w:rPr>
+          <w:rStyle w:val="Hyperlink"/>
+          <w:rFonts w:cs="Times New Roman" w:ascii="Times New Roman" w:hAnsi="Times New Roman"/>
+          <w:b/>
+          <w:bCs/>
+          <w:color w:val="auto"/>
+          <w:sz w:val="24"/>
+          <w:szCs w:val="24"/>
+          <w:u w:val="none"/>
+        </w:rPr>
+        <w:t xml:space="preserve"> </w:t>
+      </w:r>
+      <w:r>
+        <w:rPr>
+          <w:rStyle w:val="Hyperlink"/>
+          <w:rFonts w:cs="Times New Roman" w:ascii="Times New Roman" w:hAnsi="Times New Roman"/>
+          <w:b w:val="false"/>
+          <w:bCs w:val="false"/>
+          <w:color w:val="auto"/>
+          <w:sz w:val="24"/>
+          <w:szCs w:val="24"/>
+          <w:u w:val="none"/>
+        </w:rPr>
+        <w:t>stage hand for streamers</w:t>
+      </w:r>
+      <w:r>
+        <w:rPr>
+          <w:rStyle w:val="Hyperlink"/>
+          <w:rFonts w:cs="Times New Roman" w:ascii="Times New Roman" w:hAnsi="Times New Roman"/>
+          <w:b w:val="false"/>
+          <w:bCs w:val="false"/>
+          <w:color w:val="auto"/>
+          <w:sz w:val="24"/>
+          <w:szCs w:val="24"/>
+          <w:u w:val="none"/>
+        </w:rPr>
+        <w:t xml:space="preserve"> with </w:t>
+      </w:r>
+      <w:bookmarkStart w:id="11" w:name="__DdeLink__172_1291841029"/>
+      <w:r>
+        <w:rPr>
+          <w:rStyle w:val="Hyperlink"/>
+          <w:rFonts w:cs="Times New Roman" w:ascii="Times New Roman" w:hAnsi="Times New Roman"/>
+          <w:b/>
+          <w:bCs/>
+          <w:color w:val="auto"/>
+          <w:sz w:val="24"/>
+          <w:szCs w:val="24"/>
+          <w:u w:val="none"/>
+        </w:rPr>
+        <w:t xml:space="preserve">OpenAI, </w:t>
+      </w:r>
+      <w:r>
+        <w:rPr>
+          <w:rStyle w:val="Hyperlink"/>
+          <w:rFonts w:cs="Times New Roman" w:ascii="Times New Roman" w:hAnsi="Times New Roman"/>
+          <w:b/>
+          <w:bCs/>
+          <w:color w:val="auto"/>
+          <w:sz w:val="24"/>
+          <w:szCs w:val="24"/>
+          <w:u w:val="none"/>
+        </w:rPr>
+        <w:t>Nemotron 3</w:t>
+      </w:r>
+      <w:r>
+        <w:rPr>
+          <w:rStyle w:val="Hyperlink"/>
+          <w:rFonts w:cs="Times New Roman" w:ascii="Times New Roman" w:hAnsi="Times New Roman"/>
+          <w:b/>
+          <w:bCs/>
+          <w:color w:val="auto"/>
+          <w:sz w:val="24"/>
+          <w:szCs w:val="24"/>
+          <w:u w:val="none"/>
+        </w:rPr>
+        <w:t>,</w:t>
+      </w:r>
+      <w:r>
+        <w:rPr>
+          <w:rStyle w:val="Hyperlink"/>
+          <w:rFonts w:cs="Times New Roman" w:ascii="Times New Roman" w:hAnsi="Times New Roman"/>
+          <w:b w:val="false"/>
+          <w:bCs w:val="false"/>
+          <w:color w:val="auto"/>
+          <w:sz w:val="24"/>
+          <w:szCs w:val="24"/>
+          <w:u w:val="none"/>
+        </w:rPr>
+        <w:t xml:space="preserve"> </w:t>
+      </w:r>
+      <w:r>
+        <w:rPr>
+          <w:rStyle w:val="Hyperlink"/>
+          <w:rFonts w:cs="Times New Roman" w:ascii="Times New Roman" w:hAnsi="Times New Roman"/>
+          <w:b/>
+          <w:bCs/>
+          <w:color w:val="auto"/>
+          <w:sz w:val="24"/>
+          <w:szCs w:val="24"/>
+          <w:u w:val="none"/>
+        </w:rPr>
+        <w:t>React</w:t>
+      </w:r>
+      <w:r>
+        <w:rPr>
+          <w:rStyle w:val="Hyperlink"/>
+          <w:rFonts w:cs="Times New Roman" w:ascii="Times New Roman" w:hAnsi="Times New Roman"/>
+          <w:b/>
+          <w:bCs/>
+          <w:color w:val="auto"/>
+          <w:sz w:val="24"/>
+          <w:szCs w:val="24"/>
+          <w:u w:val="none"/>
+        </w:rPr>
+        <w:t xml:space="preserve">, </w:t>
+      </w:r>
+      <w:r>
+        <w:rPr>
+          <w:rStyle w:val="Hyperlink"/>
+          <w:rFonts w:cs="Times New Roman" w:ascii="Times New Roman" w:hAnsi="Times New Roman"/>
+          <w:b/>
+          <w:bCs/>
+          <w:color w:val="auto"/>
+          <w:sz w:val="24"/>
+          <w:szCs w:val="24"/>
+          <w:u w:val="none"/>
+        </w:rPr>
+        <w:t>OBS</w:t>
+      </w:r>
+      <w:bookmarkEnd w:id="11"/>
+      <w:r>
+        <w:rPr>
+          <w:rStyle w:val="Hyperlink"/>
+          <w:rFonts w:cs="Times New Roman" w:ascii="Times New Roman" w:hAnsi="Times New Roman"/>
+          <w:b w:val="false"/>
+          <w:bCs w:val="false"/>
+          <w:sz w:val="24"/>
+          <w:szCs w:val="24"/>
+          <w:u w:val="none"/>
+        </w:rPr>
+        <w:t>.</w:t>
+      </w:r>
+      <w:bookmarkEnd w:id="9"/>
+      <w:bookmarkEnd w:id="10"/>
+    </w:p>
+    <w:p>
+      <w:pPr>
+        <w:pStyle w:val="Normal"/>
+        <w:tabs>
+          <w:tab w:val="clear" w:pos="720"/>
+          <w:tab w:val="right" w:pos="9360" w:leader="none"/>
+        </w:tabs>
+        <w:spacing w:lineRule="auto" w:line="240" w:before="0" w:after="86"/>
+        <w:ind w:hanging="360" w:left="360"/>
+        <w:rPr/>
+      </w:pPr>
+      <w:hyperlink r:id="rId7">
+        <w:bookmarkStart w:id="12" w:name="__DdeLink__167_1291841029"/>
         <w:r>
           <w:rPr>
             <w:rStyle w:val="Hyperlink"/>
@@ -1138,7 +1380,7 @@
           <w:t>Papersy</w:t>
         </w:r>
       </w:hyperlink>
-      <w:bookmarkStart w:id="9" w:name="__DdeLink__159_942073057"/>
+      <w:bookmarkStart w:id="13" w:name="__DdeLink__159_942073057"/>
     </w:p>
     <w:p>
       <w:pPr>
@@ -1155,7 +1397,7 @@
         <w:ind w:hanging="360" w:left="360"/>
         <w:rPr/>
       </w:pPr>
-      <w:bookmarkStart w:id="10" w:name="__DdeLink__432_4034219878"/>
+      <w:bookmarkStart w:id="14" w:name="__DdeLink__432_4034219878"/>
       <w:r>
         <w:rPr>
           <w:rStyle w:val="Hyperlink"/>
@@ -1221,8 +1463,8 @@
         </w:rPr>
         <w:t>RAG</w:t>
       </w:r>
-      <w:bookmarkStart w:id="11" w:name="__DdeLink__374_4023190652"/>
-      <w:bookmarkEnd w:id="11"/>
+      <w:bookmarkStart w:id="15" w:name="__DdeLink__374_4023190652"/>
+      <w:bookmarkEnd w:id="15"/>
       <w:r>
         <w:rPr>
           <w:rStyle w:val="Hyperlink"/>
@@ -1274,232 +1516,9 @@
         </w:rPr>
         <w:t>.</w:t>
       </w:r>
-      <w:bookmarkEnd w:id="9"/>
-      <w:bookmarkEnd w:id="10"/>
-    </w:p>
-    <w:p>
-      <w:pPr>
-        <w:pStyle w:val="Normal"/>
-        <w:tabs>
-          <w:tab w:val="clear" w:pos="720"/>
-          <w:tab w:val="right" w:pos="9360" w:leader="none"/>
-        </w:tabs>
-        <w:spacing w:lineRule="auto" w:line="240" w:before="0" w:after="120"/>
-        <w:rPr>
-          <w:rFonts w:ascii="Times New Roman" w:hAnsi="Times New Roman" w:cs="Times New Roman"/>
-          <w:sz w:val="24"/>
-          <w:szCs w:val="24"/>
-        </w:rPr>
-      </w:pPr>
-      <w:hyperlink r:id="rId7">
-        <w:bookmarkStart w:id="12" w:name="__DdeLink__114_2555743471"/>
-        <w:r>
-          <w:rPr>
-            <w:rStyle w:val="Hyperlink"/>
-            <w:rFonts w:cs="Times New Roman" w:ascii="Times New Roman" w:hAnsi="Times New Roman"/>
-            <w:b/>
-            <w:bCs/>
-            <w:sz w:val="24"/>
-            <w:szCs w:val="24"/>
-          </w:rPr>
-          <w:t>Object Detection and Monitoring through UAV</w:t>
-        </w:r>
-      </w:hyperlink>
       <w:bookmarkEnd w:id="12"/>
-      <w:r>
-        <w:rPr>
-          <w:rFonts w:cs="Times New Roman" w:ascii="Times New Roman" w:hAnsi="Times New Roman"/>
-          <w:sz w:val="24"/>
-          <w:szCs w:val="24"/>
-        </w:rPr>
-        <w:t xml:space="preserve"> - </w:t>
-      </w:r>
-      <w:hyperlink r:id="rId8">
-        <w:r>
-          <w:rPr>
-            <w:rStyle w:val="Hyperlink"/>
-            <w:rFonts w:cs="Times New Roman" w:ascii="Times New Roman" w:hAnsi="Times New Roman"/>
-            <w:sz w:val="24"/>
-            <w:szCs w:val="24"/>
-          </w:rPr>
-          <w:t>Paper</w:t>
-        </w:r>
-      </w:hyperlink>
-      <w:r>
-        <w:rPr>
-          <w:rStyle w:val="Hyperlink"/>
-          <w:rFonts w:cs="Times New Roman" w:ascii="Times New Roman" w:hAnsi="Times New Roman"/>
-          <w:color w:val="auto"/>
-          <w:sz w:val="24"/>
-          <w:szCs w:val="24"/>
-          <w:u w:val="none"/>
-        </w:rPr>
-        <w:t xml:space="preserve"> | </w:t>
-      </w:r>
-      <w:hyperlink r:id="rId9">
-        <w:r>
-          <w:rPr>
-            <w:rStyle w:val="Hyperlink"/>
-            <w:rFonts w:cs="Times New Roman" w:ascii="Times New Roman" w:hAnsi="Times New Roman"/>
-            <w:sz w:val="24"/>
-            <w:szCs w:val="24"/>
-          </w:rPr>
-          <w:t>Video 1</w:t>
-        </w:r>
-      </w:hyperlink>
-      <w:r>
-        <w:rPr>
-          <w:rStyle w:val="Hyperlink"/>
-          <w:rFonts w:cs="Times New Roman" w:ascii="Times New Roman" w:hAnsi="Times New Roman"/>
-          <w:sz w:val="24"/>
-          <w:szCs w:val="24"/>
-          <w:u w:val="none"/>
-        </w:rPr>
-        <w:t xml:space="preserve"> </w:t>
-      </w:r>
-      <w:r>
-        <w:rPr>
-          <w:rStyle w:val="Hyperlink"/>
-          <w:rFonts w:cs="Times New Roman" w:ascii="Times New Roman" w:hAnsi="Times New Roman"/>
-          <w:color w:val="auto"/>
-          <w:sz w:val="24"/>
-          <w:szCs w:val="24"/>
-          <w:u w:val="none"/>
-        </w:rPr>
-        <w:t xml:space="preserve">| </w:t>
-      </w:r>
-      <w:hyperlink r:id="rId10">
-        <w:r>
-          <w:rPr>
-            <w:rStyle w:val="Hyperlink"/>
-            <w:rFonts w:cs="Times New Roman" w:ascii="Times New Roman" w:hAnsi="Times New Roman"/>
-            <w:sz w:val="24"/>
-            <w:szCs w:val="24"/>
-          </w:rPr>
-          <w:t>Video 2</w:t>
-        </w:r>
-      </w:hyperlink>
-    </w:p>
-    <w:p>
-      <w:pPr>
-        <w:pStyle w:val="Normal"/>
-        <w:numPr>
-          <w:ilvl w:val="0"/>
-          <w:numId w:val="1"/>
-        </w:numPr>
-        <w:pBdr>
-          <w:bottom w:val="single" w:sz="4" w:space="1" w:color="000000"/>
-        </w:pBdr>
-        <w:tabs>
-          <w:tab w:val="clear" w:pos="720"/>
-          <w:tab w:val="right" w:pos="9360" w:leader="none"/>
-        </w:tabs>
-        <w:spacing w:lineRule="auto" w:line="240" w:before="0" w:after="173"/>
-        <w:ind w:hanging="360" w:left="360"/>
-        <w:rPr/>
-      </w:pPr>
-      <w:r>
-        <w:rPr>
-          <w:rStyle w:val="Hyperlink"/>
-          <w:rFonts w:cs="Times New Roman" w:ascii="Times New Roman" w:hAnsi="Times New Roman"/>
-          <w:b/>
-          <w:bCs/>
-          <w:color w:val="auto"/>
-          <w:sz w:val="24"/>
-          <w:szCs w:val="24"/>
-          <w:u w:val="none"/>
-        </w:rPr>
-        <w:t>Engineered</w:t>
-      </w:r>
-      <w:r>
-        <w:rPr>
-          <w:rStyle w:val="Hyperlink"/>
-          <w:rFonts w:cs="Times New Roman" w:ascii="Times New Roman" w:hAnsi="Times New Roman"/>
-          <w:color w:val="auto"/>
-          <w:sz w:val="24"/>
-          <w:szCs w:val="24"/>
-          <w:u w:val="none"/>
-        </w:rPr>
-        <w:t xml:space="preserve"> a drone capable of identifying, following targets using </w:t>
-      </w:r>
-      <w:r>
-        <w:rPr>
-          <w:rStyle w:val="Hyperlink"/>
-          <w:rFonts w:cs="Times New Roman" w:ascii="Times New Roman" w:hAnsi="Times New Roman"/>
-          <w:b/>
-          <w:bCs/>
-          <w:color w:val="auto"/>
-          <w:sz w:val="24"/>
-          <w:szCs w:val="24"/>
-          <w:u w:val="none"/>
-        </w:rPr>
-        <w:t xml:space="preserve">OpenCV, </w:t>
-      </w:r>
-      <w:bookmarkStart w:id="13" w:name="__DdeLink__158_537622855"/>
-      <w:r>
-        <w:rPr>
-          <w:rStyle w:val="Hyperlink"/>
-          <w:rFonts w:cs="Times New Roman" w:ascii="Times New Roman" w:hAnsi="Times New Roman"/>
-          <w:b/>
-          <w:bCs/>
-          <w:color w:val="auto"/>
-          <w:sz w:val="24"/>
-          <w:szCs w:val="24"/>
-          <w:u w:val="none"/>
-        </w:rPr>
-        <w:t>Tensor</w:t>
-      </w:r>
-      <w:r>
-        <w:rPr>
-          <w:rStyle w:val="Hyperlink"/>
-          <w:rFonts w:cs="Times New Roman" w:ascii="Times New Roman" w:hAnsi="Times New Roman"/>
-          <w:b/>
-          <w:bCs/>
-          <w:color w:val="auto"/>
-          <w:sz w:val="24"/>
-          <w:szCs w:val="24"/>
-          <w:u w:val="none"/>
-        </w:rPr>
-        <w:t>F</w:t>
-      </w:r>
-      <w:r>
-        <w:rPr>
-          <w:rStyle w:val="Hyperlink"/>
-          <w:rFonts w:cs="Times New Roman" w:ascii="Times New Roman" w:hAnsi="Times New Roman"/>
-          <w:b/>
-          <w:bCs/>
-          <w:color w:val="auto"/>
-          <w:sz w:val="24"/>
-          <w:szCs w:val="24"/>
-          <w:u w:val="none"/>
-        </w:rPr>
-        <w:t>lo</w:t>
-      </w:r>
-      <w:r>
-        <w:rPr>
-          <w:rStyle w:val="Hyperlink"/>
-          <w:rFonts w:cs="Times New Roman" w:ascii="Times New Roman" w:hAnsi="Times New Roman"/>
-          <w:b/>
-          <w:bCs/>
-          <w:color w:val="auto"/>
-          <w:sz w:val="24"/>
-          <w:szCs w:val="24"/>
-          <w:u w:val="none"/>
-        </w:rPr>
-        <w:t>w</w:t>
-      </w:r>
-      <w:r>
-        <w:rPr>
-          <w:rStyle w:val="Hyperlink"/>
-          <w:rFonts w:cs="Times New Roman" w:ascii="Times New Roman" w:hAnsi="Times New Roman"/>
-          <w:color w:val="auto"/>
-          <w:sz w:val="24"/>
-          <w:szCs w:val="24"/>
-          <w:u w:val="none"/>
-        </w:rPr>
-        <w:t>.</w:t>
-      </w:r>
       <w:bookmarkEnd w:id="13"/>
+      <w:bookmarkEnd w:id="14"/>
     </w:p>
     <w:p>
       <w:pPr>
@@ -1516,7 +1535,7 @@
           <w:szCs w:val="24"/>
         </w:rPr>
       </w:pPr>
-      <w:bookmarkStart w:id="14" w:name="__DdeLink__65_622835337"/>
+      <w:bookmarkStart w:id="16" w:name="__DdeLink__65_622835337"/>
       <w:r>
         <w:rPr>
           <w:rFonts w:cs="Times New Roman" w:ascii="Times New Roman" w:hAnsi="Times New Roman"/>
@@ -1529,7 +1548,7 @@
       </w:r>
       <w:bookmarkEnd w:id="6"/>
       <w:bookmarkEnd w:id="7"/>
-      <w:bookmarkEnd w:id="14"/>
+      <w:bookmarkEnd w:id="16"/>
     </w:p>
     <w:p>
       <w:pPr>
@@ -1704,7 +1723,7 @@
           <w:szCs w:val="24"/>
         </w:rPr>
       </w:pPr>
-      <w:bookmarkStart w:id="15" w:name="__DdeLink__293_2421298475"/>
+      <w:bookmarkStart w:id="17" w:name="__DdeLink__293_2421298475"/>
       <w:r>
         <w:rPr>
           <w:rFonts w:eastAsia="Calibri" w:cs="Times New Roman" w:ascii="Times New Roman" w:hAnsi="Times New Roman"/>
@@ -1714,7 +1733,7 @@
         </w:rPr>
         <w:t>Cloud Platforms: AWS EC2, ECS, Lambda, S3, CloudFront, RDS, DynamoDB</w:t>
       </w:r>
-      <w:bookmarkEnd w:id="15"/>
+      <w:bookmarkEnd w:id="17"/>
     </w:p>
     <w:sectPr>
       <w:type w:val="nextPage"/>

</xml_diff>

<commit_message>
update project sites, remove not tech resume
</commit_message>
<xml_diff>
--- a/resume.docx
+++ b/resume.docx
@@ -859,8 +859,8 @@
         </w:rPr>
         <w:t xml:space="preserve"> during COVID-19 in Ho Chi Minh City.</w:t>
       </w:r>
-      <w:bookmarkStart w:id="6" w:name="__DdeLink__95_1413304929"/>
-      <w:bookmarkStart w:id="7" w:name="__DdeLink__100_1413304929"/>
+      <w:bookmarkStart w:id="6" w:name="__DdeLink__100_1413304929"/>
+      <w:bookmarkStart w:id="7" w:name="__DdeLink__95_1413304929"/>
     </w:p>
     <w:p>
       <w:pPr>
@@ -1193,33 +1193,7 @@
           <w:szCs w:val="24"/>
           <w:u w:val="none"/>
         </w:rPr>
-        <w:t xml:space="preserve">agentic </w:t>
-      </w:r>
-      <w:r>
-        <w:rPr>
-          <w:rStyle w:val="Hyperlink"/>
-          <w:rFonts w:cs="Times New Roman" w:ascii="Times New Roman" w:hAnsi="Times New Roman"/>
-          <w:b/>
-          <w:bCs/>
-          <w:color w:val="auto"/>
-          <w:sz w:val="24"/>
-          <w:szCs w:val="24"/>
-          <w:u w:val="none"/>
-        </w:rPr>
-        <w:t>AI</w:t>
-      </w:r>
-      <w:r>
-        <w:rPr>
-          <w:rStyle w:val="Hyperlink"/>
-          <w:rFonts w:cs="Times New Roman" w:ascii="Times New Roman" w:hAnsi="Times New Roman"/>
-          <w:b/>
-          <w:bCs/>
-          <w:color w:val="auto"/>
-          <w:sz w:val="24"/>
-          <w:szCs w:val="24"/>
-          <w:u w:val="none"/>
-        </w:rPr>
-        <w:t xml:space="preserve"> </w:t>
+        <w:t xml:space="preserve">agentic AI </w:t>
       </w:r>
       <w:r>
         <w:rPr>
@@ -1232,7 +1206,21 @@
           <w:szCs w:val="24"/>
           <w:u w:val="none"/>
         </w:rPr>
-        <w:t>stage hand for streamers</w:t>
+        <w:t xml:space="preserve">stage hand for streamers with </w:t>
+      </w:r>
+      <w:bookmarkStart w:id="11" w:name="__DdeLink__172_1291841029"/>
+      <w:r>
+        <w:rPr>
+          <w:rStyle w:val="Hyperlink"/>
+          <w:rFonts w:cs="Times New Roman" w:ascii="Times New Roman" w:hAnsi="Times New Roman"/>
+          <w:b/>
+          <w:bCs/>
+          <w:color w:val="auto"/>
+          <w:sz w:val="24"/>
+          <w:szCs w:val="24"/>
+          <w:u w:val="none"/>
+        </w:rPr>
+        <w:t>OpenAI, Nemotron 3,</w:t>
       </w:r>
       <w:r>
         <w:rPr>
@@ -1245,9 +1233,8 @@
           <w:szCs w:val="24"/>
           <w:u w:val="none"/>
         </w:rPr>
-        <w:t xml:space="preserve"> with </w:t>
-      </w:r>
-      <w:bookmarkStart w:id="11" w:name="__DdeLink__172_1291841029"/>
+        <w:t xml:space="preserve"> </w:t>
+      </w:r>
       <w:r>
         <w:rPr>
           <w:rStyle w:val="Hyperlink"/>
@@ -1259,85 +1246,7 @@
           <w:szCs w:val="24"/>
           <w:u w:val="none"/>
         </w:rPr>
-        <w:t xml:space="preserve">OpenAI, </w:t>
-      </w:r>
-      <w:r>
-        <w:rPr>
-          <w:rStyle w:val="Hyperlink"/>
-          <w:rFonts w:cs="Times New Roman" w:ascii="Times New Roman" w:hAnsi="Times New Roman"/>
-          <w:b/>
-          <w:bCs/>
-          <w:color w:val="auto"/>
-          <w:sz w:val="24"/>
-          <w:szCs w:val="24"/>
-          <w:u w:val="none"/>
-        </w:rPr>
-        <w:t>Nemotron 3</w:t>
-      </w:r>
-      <w:r>
-        <w:rPr>
-          <w:rStyle w:val="Hyperlink"/>
-          <w:rFonts w:cs="Times New Roman" w:ascii="Times New Roman" w:hAnsi="Times New Roman"/>
-          <w:b/>
-          <w:bCs/>
-          <w:color w:val="auto"/>
-          <w:sz w:val="24"/>
-          <w:szCs w:val="24"/>
-          <w:u w:val="none"/>
-        </w:rPr>
-        <w:t>,</w:t>
-      </w:r>
-      <w:r>
-        <w:rPr>
-          <w:rStyle w:val="Hyperlink"/>
-          <w:rFonts w:cs="Times New Roman" w:ascii="Times New Roman" w:hAnsi="Times New Roman"/>
-          <w:b w:val="false"/>
-          <w:bCs w:val="false"/>
-          <w:color w:val="auto"/>
-          <w:sz w:val="24"/>
-          <w:szCs w:val="24"/>
-          <w:u w:val="none"/>
-        </w:rPr>
-        <w:t xml:space="preserve"> </w:t>
-      </w:r>
-      <w:r>
-        <w:rPr>
-          <w:rStyle w:val="Hyperlink"/>
-          <w:rFonts w:cs="Times New Roman" w:ascii="Times New Roman" w:hAnsi="Times New Roman"/>
-          <w:b/>
-          <w:bCs/>
-          <w:color w:val="auto"/>
-          <w:sz w:val="24"/>
-          <w:szCs w:val="24"/>
-          <w:u w:val="none"/>
-        </w:rPr>
-        <w:t>React</w:t>
-      </w:r>
-      <w:r>
-        <w:rPr>
-          <w:rStyle w:val="Hyperlink"/>
-          <w:rFonts w:cs="Times New Roman" w:ascii="Times New Roman" w:hAnsi="Times New Roman"/>
-          <w:b/>
-          <w:bCs/>
-          <w:color w:val="auto"/>
-          <w:sz w:val="24"/>
-          <w:szCs w:val="24"/>
-          <w:u w:val="none"/>
-        </w:rPr>
-        <w:t xml:space="preserve">, </w:t>
-      </w:r>
-      <w:r>
-        <w:rPr>
-          <w:rStyle w:val="Hyperlink"/>
-          <w:rFonts w:cs="Times New Roman" w:ascii="Times New Roman" w:hAnsi="Times New Roman"/>
-          <w:b/>
-          <w:bCs/>
-          <w:color w:val="auto"/>
-          <w:sz w:val="24"/>
-          <w:szCs w:val="24"/>
-          <w:u w:val="none"/>
-        </w:rPr>
-        <w:t>OBS</w:t>
+        <w:t>React, OBS</w:t>
       </w:r>
       <w:bookmarkEnd w:id="11"/>
       <w:r>

</xml_diff>

<commit_message>
- update projects and resumes
</commit_message>
<xml_diff>
--- a/resume.docx
+++ b/resume.docx
@@ -118,17 +118,7 @@
           <w:sz w:val="24"/>
           <w:szCs w:val="24"/>
         </w:rPr>
-        <w:t xml:space="preserve">WORK </w:t>
-      </w:r>
-      <w:r>
-        <w:rPr>
-          <w:rFonts w:ascii="Times New Roman" w:hAnsi="Times New Roman"/>
-          <w:b w:val="false"/>
-          <w:smallCaps/>
-          <w:sz w:val="24"/>
-          <w:szCs w:val="24"/>
-        </w:rPr>
-        <w:t>EXPERIENCE</w:t>
+        <w:t>WORK EXPERIENCE</w:t>
       </w:r>
     </w:p>
     <w:p>
@@ -921,7 +911,7 @@
             <w:sz w:val="24"/>
             <w:szCs w:val="24"/>
           </w:rPr>
-          <w:t>AuTuber</w:t>
+          <w:t>JobbedIn</w:t>
         </w:r>
       </w:hyperlink>
       <w:r>
@@ -945,7 +935,7 @@
           <w:szCs w:val="24"/>
           <w:u w:val="none"/>
         </w:rPr>
-        <w:t>OpenAI</w:t>
+        <w:t>Next.js, OpenAI</w:t>
       </w:r>
       <w:r>
         <w:rPr>
@@ -974,37 +964,7 @@
           <w:szCs w:val="24"/>
           <w:u w:val="none"/>
         </w:rPr>
-        <w:t>Nemotron 3,</w:t>
-      </w:r>
-      <w:r>
-        <w:rPr>
-          <w:rStyle w:val="Hyperlink"/>
-          <w:rFonts w:cs="Times New Roman" w:ascii="Times New Roman" w:hAnsi="Times New Roman"/>
-          <w:b w:val="false"/>
-          <w:bCs w:val="false"/>
-          <w:i w:val="false"/>
-          <w:iCs w:val="false"/>
-          <w:color w:val="auto"/>
-          <w:sz w:val="24"/>
-          <w:szCs w:val="24"/>
-          <w:u w:val="none"/>
-        </w:rPr>
-        <w:t xml:space="preserve"> </w:t>
-      </w:r>
-      <w:r>
-        <w:rPr>
-          <w:rStyle w:val="Hyperlink"/>
-          <w:rFonts w:cs="Times New Roman" w:ascii="Times New Roman" w:hAnsi="Times New Roman"/>
-          <w:b/>
-          <w:bCs/>
-          <w:i w:val="false"/>
-          <w:iCs w:val="false"/>
-          <w:color w:val="auto"/>
-          <w:sz w:val="24"/>
-          <w:szCs w:val="24"/>
-          <w:u w:val="none"/>
-        </w:rPr>
-        <w:t>React, OBS</w:t>
+        <w:t>LangGraph, Postgres</w:t>
       </w:r>
       <w:r>
         <w:rPr>
@@ -1173,8 +1133,25 @@
           <w:szCs w:val="24"/>
           <w:u w:val="none"/>
         </w:rPr>
-        <w:t>LangChain, pgvector</w:t>
+        <w:t xml:space="preserve">LangChain, </w:t>
       </w:r>
+      <w:bookmarkStart w:id="4" w:name="__DdeLink__145_3691203199"/>
+      <w:r>
+        <w:rPr>
+          <w:rStyle w:val="Hyperlink"/>
+          <w:rFonts w:cs="Times New Roman" w:ascii="Times New Roman" w:hAnsi="Times New Roman"/>
+          <w:b/>
+          <w:bCs/>
+          <w:i w:val="false"/>
+          <w:iCs w:val="false"/>
+          <w:color w:val="auto"/>
+          <w:sz w:val="24"/>
+          <w:szCs w:val="24"/>
+          <w:u w:val="none"/>
+        </w:rPr>
+        <w:t>Postgres</w:t>
+      </w:r>
+      <w:bookmarkEnd w:id="4"/>
       <w:r>
         <w:rPr>
           <w:rFonts w:ascii="Times New Roman" w:hAnsi="Times New Roman"/>
@@ -1499,7 +1476,7 @@
           <w:szCs w:val="24"/>
         </w:rPr>
       </w:pPr>
-      <w:bookmarkStart w:id="4" w:name="__DdeLink__293_2421298475"/>
+      <w:bookmarkStart w:id="5" w:name="__DdeLink__293_2421298475"/>
       <w:bookmarkEnd w:id="0"/>
       <w:r>
         <w:rPr>
@@ -1521,7 +1498,7 @@
         </w:rPr>
         <w:t>: AWS EC2, ECS, Lambda, S3, CloudFront, RDS, DynamoDB</w:t>
       </w:r>
-      <w:bookmarkEnd w:id="4"/>
+      <w:bookmarkEnd w:id="5"/>
     </w:p>
     <w:p>
       <w:pPr>
@@ -1610,7 +1587,7 @@
         </w:rPr>
         <w:tab/>
       </w:r>
-      <w:bookmarkStart w:id="5" w:name="__DdeLink__436_2627214314"/>
+      <w:bookmarkStart w:id="6" w:name="__DdeLink__436_2627214314"/>
       <w:r>
         <w:rPr>
           <w:rFonts w:cs="Times New Roman" w:ascii="Times New Roman" w:hAnsi="Times New Roman"/>
@@ -1621,7 +1598,7 @@
         </w:rPr>
         <w:t>6</w:t>
       </w:r>
-      <w:bookmarkEnd w:id="5"/>
+      <w:bookmarkEnd w:id="6"/>
       <w:r>
         <w:rPr>
           <w:rFonts w:cs="Times New Roman" w:ascii="Times New Roman" w:hAnsi="Times New Roman"/>
@@ -1741,6 +1718,7 @@
         </w:tabs>
         <w:ind w:left="1080" w:hanging="360"/>
       </w:pPr>
+      <w:rPr/>
     </w:lvl>
     <w:lvl w:ilvl="2">
       <w:start w:val="1"/>
@@ -1753,6 +1731,7 @@
         </w:tabs>
         <w:ind w:left="1440" w:hanging="360"/>
       </w:pPr>
+      <w:rPr/>
     </w:lvl>
     <w:lvl w:ilvl="3">
       <w:start w:val="1"/>
@@ -1765,6 +1744,7 @@
         </w:tabs>
         <w:ind w:left="1800" w:hanging="360"/>
       </w:pPr>
+      <w:rPr/>
     </w:lvl>
     <w:lvl w:ilvl="4">
       <w:start w:val="1"/>
@@ -1777,6 +1757,7 @@
         </w:tabs>
         <w:ind w:left="2160" w:hanging="360"/>
       </w:pPr>
+      <w:rPr/>
     </w:lvl>
     <w:lvl w:ilvl="5">
       <w:start w:val="1"/>
@@ -1789,6 +1770,7 @@
         </w:tabs>
         <w:ind w:left="2520" w:hanging="360"/>
       </w:pPr>
+      <w:rPr/>
     </w:lvl>
     <w:lvl w:ilvl="6">
       <w:start w:val="1"/>
@@ -1801,6 +1783,7 @@
         </w:tabs>
         <w:ind w:left="2880" w:hanging="360"/>
       </w:pPr>
+      <w:rPr/>
     </w:lvl>
     <w:lvl w:ilvl="7">
       <w:start w:val="1"/>
@@ -1813,6 +1796,7 @@
         </w:tabs>
         <w:ind w:left="3240" w:hanging="360"/>
       </w:pPr>
+      <w:rPr/>
     </w:lvl>
     <w:lvl w:ilvl="8">
       <w:start w:val="1"/>
@@ -1825,6 +1809,7 @@
         </w:tabs>
         <w:ind w:left="3600" w:hanging="360"/>
       </w:pPr>
+      <w:rPr/>
     </w:lvl>
   </w:abstractNum>
   <w:abstractNum w:abstractNumId="2">
@@ -1854,6 +1839,7 @@
         </w:tabs>
         <w:ind w:left="1080" w:hanging="360"/>
       </w:pPr>
+      <w:rPr/>
     </w:lvl>
     <w:lvl w:ilvl="2">
       <w:start w:val="1"/>
@@ -1866,6 +1852,7 @@
         </w:tabs>
         <w:ind w:left="1440" w:hanging="360"/>
       </w:pPr>
+      <w:rPr/>
     </w:lvl>
     <w:lvl w:ilvl="3">
       <w:start w:val="1"/>
@@ -1878,6 +1865,7 @@
         </w:tabs>
         <w:ind w:left="1800" w:hanging="360"/>
       </w:pPr>
+      <w:rPr/>
     </w:lvl>
     <w:lvl w:ilvl="4">
       <w:start w:val="1"/>
@@ -1890,6 +1878,7 @@
         </w:tabs>
         <w:ind w:left="2160" w:hanging="360"/>
       </w:pPr>
+      <w:rPr/>
     </w:lvl>
     <w:lvl w:ilvl="5">
       <w:start w:val="1"/>
@@ -1902,6 +1891,7 @@
         </w:tabs>
         <w:ind w:left="2520" w:hanging="360"/>
       </w:pPr>
+      <w:rPr/>
     </w:lvl>
     <w:lvl w:ilvl="6">
       <w:start w:val="1"/>
@@ -1914,6 +1904,7 @@
         </w:tabs>
         <w:ind w:left="2880" w:hanging="360"/>
       </w:pPr>
+      <w:rPr/>
     </w:lvl>
     <w:lvl w:ilvl="7">
       <w:start w:val="1"/>
@@ -1926,6 +1917,7 @@
         </w:tabs>
         <w:ind w:left="3240" w:hanging="360"/>
       </w:pPr>
+      <w:rPr/>
     </w:lvl>
     <w:lvl w:ilvl="8">
       <w:start w:val="1"/>
@@ -1938,6 +1930,7 @@
         </w:tabs>
         <w:ind w:left="3600" w:hanging="360"/>
       </w:pPr>
+      <w:rPr/>
     </w:lvl>
   </w:abstractNum>
   <w:abstractNum w:abstractNumId="3">
@@ -1967,6 +1960,7 @@
         </w:tabs>
         <w:ind w:left="1080" w:hanging="360"/>
       </w:pPr>
+      <w:rPr/>
     </w:lvl>
     <w:lvl w:ilvl="2">
       <w:start w:val="1"/>
@@ -1979,6 +1973,7 @@
         </w:tabs>
         <w:ind w:left="1440" w:hanging="360"/>
       </w:pPr>
+      <w:rPr/>
     </w:lvl>
     <w:lvl w:ilvl="3">
       <w:start w:val="1"/>
@@ -1991,6 +1986,7 @@
         </w:tabs>
         <w:ind w:left="1800" w:hanging="360"/>
       </w:pPr>
+      <w:rPr/>
     </w:lvl>
     <w:lvl w:ilvl="4">
       <w:start w:val="1"/>
@@ -2003,6 +1999,7 @@
         </w:tabs>
         <w:ind w:left="2160" w:hanging="360"/>
       </w:pPr>
+      <w:rPr/>
     </w:lvl>
     <w:lvl w:ilvl="5">
       <w:start w:val="1"/>
@@ -2015,6 +2012,7 @@
         </w:tabs>
         <w:ind w:left="2520" w:hanging="360"/>
       </w:pPr>
+      <w:rPr/>
     </w:lvl>
     <w:lvl w:ilvl="6">
       <w:start w:val="1"/>
@@ -2027,6 +2025,7 @@
         </w:tabs>
         <w:ind w:left="2880" w:hanging="360"/>
       </w:pPr>
+      <w:rPr/>
     </w:lvl>
     <w:lvl w:ilvl="7">
       <w:start w:val="1"/>
@@ -2039,6 +2038,7 @@
         </w:tabs>
         <w:ind w:left="3240" w:hanging="360"/>
       </w:pPr>
+      <w:rPr/>
     </w:lvl>
     <w:lvl w:ilvl="8">
       <w:start w:val="1"/>
@@ -2051,6 +2051,7 @@
         </w:tabs>
         <w:ind w:left="3600" w:hanging="360"/>
       </w:pPr>
+      <w:rPr/>
     </w:lvl>
   </w:abstractNum>
   <w:abstractNum w:abstractNumId="4">
@@ -2078,6 +2079,7 @@
         </w:tabs>
         <w:ind w:left="1080" w:hanging="360"/>
       </w:pPr>
+      <w:rPr/>
     </w:lvl>
     <w:lvl w:ilvl="2">
       <w:start w:val="1"/>
@@ -2090,6 +2092,7 @@
         </w:tabs>
         <w:ind w:left="1440" w:hanging="360"/>
       </w:pPr>
+      <w:rPr/>
     </w:lvl>
     <w:lvl w:ilvl="3">
       <w:start w:val="1"/>
@@ -2102,6 +2105,7 @@
         </w:tabs>
         <w:ind w:left="1800" w:hanging="360"/>
       </w:pPr>
+      <w:rPr/>
     </w:lvl>
     <w:lvl w:ilvl="4">
       <w:start w:val="1"/>
@@ -2114,6 +2118,7 @@
         </w:tabs>
         <w:ind w:left="2160" w:hanging="360"/>
       </w:pPr>
+      <w:rPr/>
     </w:lvl>
     <w:lvl w:ilvl="5">
       <w:start w:val="1"/>
@@ -2126,6 +2131,7 @@
         </w:tabs>
         <w:ind w:left="2520" w:hanging="360"/>
       </w:pPr>
+      <w:rPr/>
     </w:lvl>
     <w:lvl w:ilvl="6">
       <w:start w:val="1"/>
@@ -2138,6 +2144,7 @@
         </w:tabs>
         <w:ind w:left="2880" w:hanging="360"/>
       </w:pPr>
+      <w:rPr/>
     </w:lvl>
     <w:lvl w:ilvl="7">
       <w:start w:val="1"/>
@@ -2150,6 +2157,7 @@
         </w:tabs>
         <w:ind w:left="3240" w:hanging="360"/>
       </w:pPr>
+      <w:rPr/>
     </w:lvl>
     <w:lvl w:ilvl="8">
       <w:start w:val="1"/>
@@ -2162,6 +2170,7 @@
         </w:tabs>
         <w:ind w:left="3600" w:hanging="360"/>
       </w:pPr>
+      <w:rPr/>
     </w:lvl>
   </w:abstractNum>
   <w:abstractNum w:abstractNumId="5">
@@ -2189,6 +2198,7 @@
         </w:tabs>
         <w:ind w:left="1080" w:hanging="360"/>
       </w:pPr>
+      <w:rPr/>
     </w:lvl>
     <w:lvl w:ilvl="2">
       <w:start w:val="1"/>
@@ -2201,6 +2211,7 @@
         </w:tabs>
         <w:ind w:left="1440" w:hanging="360"/>
       </w:pPr>
+      <w:rPr/>
     </w:lvl>
     <w:lvl w:ilvl="3">
       <w:start w:val="1"/>
@@ -2213,6 +2224,7 @@
         </w:tabs>
         <w:ind w:left="1800" w:hanging="360"/>
       </w:pPr>
+      <w:rPr/>
     </w:lvl>
     <w:lvl w:ilvl="4">
       <w:start w:val="1"/>
@@ -2225,6 +2237,7 @@
         </w:tabs>
         <w:ind w:left="2160" w:hanging="360"/>
       </w:pPr>
+      <w:rPr/>
     </w:lvl>
     <w:lvl w:ilvl="5">
       <w:start w:val="1"/>
@@ -2237,6 +2250,7 @@
         </w:tabs>
         <w:ind w:left="2520" w:hanging="360"/>
       </w:pPr>
+      <w:rPr/>
     </w:lvl>
     <w:lvl w:ilvl="6">
       <w:start w:val="1"/>
@@ -2249,6 +2263,7 @@
         </w:tabs>
         <w:ind w:left="2880" w:hanging="360"/>
       </w:pPr>
+      <w:rPr/>
     </w:lvl>
     <w:lvl w:ilvl="7">
       <w:start w:val="1"/>
@@ -2261,6 +2276,7 @@
         </w:tabs>
         <w:ind w:left="3240" w:hanging="360"/>
       </w:pPr>
+      <w:rPr/>
     </w:lvl>
     <w:lvl w:ilvl="8">
       <w:start w:val="1"/>
@@ -2273,6 +2289,7 @@
         </w:tabs>
         <w:ind w:left="3600" w:hanging="360"/>
       </w:pPr>
+      <w:rPr/>
     </w:lvl>
   </w:abstractNum>
   <w:abstractNum w:abstractNumId="6">
@@ -2300,6 +2317,7 @@
         </w:tabs>
         <w:ind w:left="1080" w:hanging="360"/>
       </w:pPr>
+      <w:rPr/>
     </w:lvl>
     <w:lvl w:ilvl="2">
       <w:start w:val="1"/>
@@ -2312,6 +2330,7 @@
         </w:tabs>
         <w:ind w:left="1440" w:hanging="360"/>
       </w:pPr>
+      <w:rPr/>
     </w:lvl>
     <w:lvl w:ilvl="3">
       <w:start w:val="1"/>
@@ -2324,6 +2343,7 @@
         </w:tabs>
         <w:ind w:left="1800" w:hanging="360"/>
       </w:pPr>
+      <w:rPr/>
     </w:lvl>
     <w:lvl w:ilvl="4">
       <w:start w:val="1"/>
@@ -2336,6 +2356,7 @@
         </w:tabs>
         <w:ind w:left="2160" w:hanging="360"/>
       </w:pPr>
+      <w:rPr/>
     </w:lvl>
     <w:lvl w:ilvl="5">
       <w:start w:val="1"/>
@@ -2348,6 +2369,7 @@
         </w:tabs>
         <w:ind w:left="2520" w:hanging="360"/>
       </w:pPr>
+      <w:rPr/>
     </w:lvl>
     <w:lvl w:ilvl="6">
       <w:start w:val="1"/>
@@ -2360,6 +2382,7 @@
         </w:tabs>
         <w:ind w:left="2880" w:hanging="360"/>
       </w:pPr>
+      <w:rPr/>
     </w:lvl>
     <w:lvl w:ilvl="7">
       <w:start w:val="1"/>
@@ -2372,6 +2395,7 @@
         </w:tabs>
         <w:ind w:left="3240" w:hanging="360"/>
       </w:pPr>
+      <w:rPr/>
     </w:lvl>
     <w:lvl w:ilvl="8">
       <w:start w:val="1"/>
@@ -2384,6 +2408,7 @@
         </w:tabs>
         <w:ind w:left="3600" w:hanging="360"/>
       </w:pPr>
+      <w:rPr/>
     </w:lvl>
   </w:abstractNum>
   <w:abstractNum w:abstractNumId="7">
@@ -2534,7 +2559,7 @@
   <w:docDefaults>
     <w:rPrDefault>
       <w:rPr>
-        <w:rFonts w:ascii="Cambria" w:hAnsi="Cambria" w:eastAsia="ＭＳ 明朝" w:cs="" w:asciiTheme="minorHAnsi" w:cstheme="minorBidi" w:eastAsiaTheme="minorEastAsia" w:hAnsiTheme="minorHAnsi"/>
+        <w:rFonts w:ascii="Cambria" w:hAnsi="Cambria" w:eastAsia="" w:cs="" w:asciiTheme="minorHAnsi" w:cstheme="minorBidi" w:eastAsiaTheme="minorEastAsia" w:hAnsiTheme="minorHAnsi"/>
         <w:sz w:val="22"/>
         <w:szCs w:val="22"/>
         <w:lang w:val="en-US" w:eastAsia="en-US" w:bidi="ar-SA"/>
@@ -2691,12 +2716,13 @@
     <w:rsid w:val="00fc693f"/>
     <w:pPr>
       <w:widowControl/>
+      <w:suppressAutoHyphens w:val="true"/>
       <w:bidi w:val="0"/>
       <w:spacing w:lineRule="auto" w:line="276" w:before="0" w:after="200"/>
       <w:jc w:val="left"/>
     </w:pPr>
     <w:rPr>
-      <w:rFonts w:ascii="Cambria" w:hAnsi="Cambria" w:eastAsia="ＭＳ 明朝" w:cs="" w:asciiTheme="minorHAnsi" w:cstheme="minorBidi" w:eastAsiaTheme="minorEastAsia" w:hAnsiTheme="minorHAnsi"/>
+      <w:rFonts w:ascii="Cambria" w:hAnsi="Cambria" w:eastAsia="" w:cs="" w:asciiTheme="minorHAnsi" w:cstheme="minorBidi" w:eastAsiaTheme="minorEastAsia" w:hAnsiTheme="minorHAnsi"/>
       <w:color w:val="auto"/>
       <w:kern w:val="0"/>
       <w:sz w:val="22"/>
@@ -2719,7 +2745,7 @@
       <w:outlineLvl w:val="0"/>
     </w:pPr>
     <w:rPr>
-      <w:rFonts w:ascii="Calibri" w:hAnsi="Calibri" w:eastAsia="ＭＳ ゴシック" w:cs="" w:asciiTheme="majorHAnsi" w:cstheme="majorBidi" w:eastAsiaTheme="majorEastAsia" w:hAnsiTheme="majorHAnsi"/>
+      <w:rFonts w:ascii="Calibri" w:hAnsi="Calibri" w:eastAsia="" w:cs="" w:asciiTheme="majorHAnsi" w:cstheme="majorBidi" w:eastAsiaTheme="majorEastAsia" w:hAnsiTheme="majorHAnsi"/>
       <w:b/>
       <w:bCs/>
       <w:color w:themeColor="accent1" w:themeShade="bf" w:val="365F91"/>
@@ -2743,7 +2769,7 @@
       <w:outlineLvl w:val="1"/>
     </w:pPr>
     <w:rPr>
-      <w:rFonts w:ascii="Calibri" w:hAnsi="Calibri" w:eastAsia="ＭＳ ゴシック" w:cs="" w:asciiTheme="majorHAnsi" w:cstheme="majorBidi" w:eastAsiaTheme="majorEastAsia" w:hAnsiTheme="majorHAnsi"/>
+      <w:rFonts w:ascii="Calibri" w:hAnsi="Calibri" w:eastAsia="" w:cs="" w:asciiTheme="majorHAnsi" w:cstheme="majorBidi" w:eastAsiaTheme="majorEastAsia" w:hAnsiTheme="majorHAnsi"/>
       <w:b/>
       <w:bCs/>
       <w:color w:themeColor="accent1" w:val="4F81BD"/>
@@ -2767,7 +2793,7 @@
       <w:outlineLvl w:val="2"/>
     </w:pPr>
     <w:rPr>
-      <w:rFonts w:ascii="Calibri" w:hAnsi="Calibri" w:eastAsia="ＭＳ ゴシック" w:cs="" w:asciiTheme="majorHAnsi" w:cstheme="majorBidi" w:eastAsiaTheme="majorEastAsia" w:hAnsiTheme="majorHAnsi"/>
+      <w:rFonts w:ascii="Calibri" w:hAnsi="Calibri" w:eastAsia="" w:cs="" w:asciiTheme="majorHAnsi" w:cstheme="majorBidi" w:eastAsiaTheme="majorEastAsia" w:hAnsiTheme="majorHAnsi"/>
       <w:b/>
       <w:bCs/>
       <w:color w:themeColor="accent1" w:val="4F81BD"/>
@@ -2790,7 +2816,7 @@
       <w:outlineLvl w:val="3"/>
     </w:pPr>
     <w:rPr>
-      <w:rFonts w:ascii="Calibri" w:hAnsi="Calibri" w:eastAsia="ＭＳ ゴシック" w:cs="" w:asciiTheme="majorHAnsi" w:cstheme="majorBidi" w:eastAsiaTheme="majorEastAsia" w:hAnsiTheme="majorHAnsi"/>
+      <w:rFonts w:ascii="Calibri" w:hAnsi="Calibri" w:eastAsia="" w:cs="" w:asciiTheme="majorHAnsi" w:cstheme="majorBidi" w:eastAsiaTheme="majorEastAsia" w:hAnsiTheme="majorHAnsi"/>
       <w:b/>
       <w:bCs/>
       <w:i/>
@@ -2815,7 +2841,7 @@
       <w:outlineLvl w:val="4"/>
     </w:pPr>
     <w:rPr>
-      <w:rFonts w:ascii="Calibri" w:hAnsi="Calibri" w:eastAsia="ＭＳ ゴシック" w:cs="" w:asciiTheme="majorHAnsi" w:cstheme="majorBidi" w:eastAsiaTheme="majorEastAsia" w:hAnsiTheme="majorHAnsi"/>
+      <w:rFonts w:ascii="Calibri" w:hAnsi="Calibri" w:eastAsia="" w:cs="" w:asciiTheme="majorHAnsi" w:cstheme="majorBidi" w:eastAsiaTheme="majorEastAsia" w:hAnsiTheme="majorHAnsi"/>
       <w:color w:themeColor="accent1" w:themeShade="7f" w:val="243F60"/>
     </w:rPr>
   </w:style>
@@ -2836,7 +2862,7 @@
       <w:outlineLvl w:val="5"/>
     </w:pPr>
     <w:rPr>
-      <w:rFonts w:ascii="Calibri" w:hAnsi="Calibri" w:eastAsia="ＭＳ ゴシック" w:cs="" w:asciiTheme="majorHAnsi" w:cstheme="majorBidi" w:eastAsiaTheme="majorEastAsia" w:hAnsiTheme="majorHAnsi"/>
+      <w:rFonts w:ascii="Calibri" w:hAnsi="Calibri" w:eastAsia="" w:cs="" w:asciiTheme="majorHAnsi" w:cstheme="majorBidi" w:eastAsiaTheme="majorEastAsia" w:hAnsiTheme="majorHAnsi"/>
       <w:i/>
       <w:iCs/>
       <w:color w:themeColor="accent1" w:themeShade="7f" w:val="243F60"/>
@@ -2859,7 +2885,7 @@
       <w:outlineLvl w:val="6"/>
     </w:pPr>
     <w:rPr>
-      <w:rFonts w:ascii="Calibri" w:hAnsi="Calibri" w:eastAsia="ＭＳ ゴシック" w:cs="" w:asciiTheme="majorHAnsi" w:cstheme="majorBidi" w:eastAsiaTheme="majorEastAsia" w:hAnsiTheme="majorHAnsi"/>
+      <w:rFonts w:ascii="Calibri" w:hAnsi="Calibri" w:eastAsia="" w:cs="" w:asciiTheme="majorHAnsi" w:cstheme="majorBidi" w:eastAsiaTheme="majorEastAsia" w:hAnsiTheme="majorHAnsi"/>
       <w:i/>
       <w:iCs/>
       <w:color w:themeColor="text1" w:themeTint="bf" w:val="404040"/>
@@ -2882,7 +2908,7 @@
       <w:outlineLvl w:val="7"/>
     </w:pPr>
     <w:rPr>
-      <w:rFonts w:ascii="Calibri" w:hAnsi="Calibri" w:eastAsia="ＭＳ ゴシック" w:cs="" w:asciiTheme="majorHAnsi" w:cstheme="majorBidi" w:eastAsiaTheme="majorEastAsia" w:hAnsiTheme="majorHAnsi"/>
+      <w:rFonts w:ascii="Calibri" w:hAnsi="Calibri" w:eastAsia="" w:cs="" w:asciiTheme="majorHAnsi" w:cstheme="majorBidi" w:eastAsiaTheme="majorEastAsia" w:hAnsiTheme="majorHAnsi"/>
       <w:color w:themeColor="accent1" w:val="4F81BD"/>
       <w:sz w:val="20"/>
       <w:szCs w:val="20"/>
@@ -2905,7 +2931,7 @@
       <w:outlineLvl w:val="8"/>
     </w:pPr>
     <w:rPr>
-      <w:rFonts w:ascii="Calibri" w:hAnsi="Calibri" w:eastAsia="ＭＳ ゴシック" w:cs="" w:asciiTheme="majorHAnsi" w:cstheme="majorBidi" w:eastAsiaTheme="majorEastAsia" w:hAnsiTheme="majorHAnsi"/>
+      <w:rFonts w:ascii="Calibri" w:hAnsi="Calibri" w:eastAsia="" w:cs="" w:asciiTheme="majorHAnsi" w:cstheme="majorBidi" w:eastAsiaTheme="majorEastAsia" w:hAnsiTheme="majorHAnsi"/>
       <w:i/>
       <w:iCs/>
       <w:color w:themeColor="text1" w:themeTint="bf" w:val="404040"/>
@@ -2947,7 +2973,7 @@
     <w:qFormat/>
     <w:rsid w:val="00fc693f"/>
     <w:rPr>
-      <w:rFonts w:ascii="Calibri" w:hAnsi="Calibri" w:eastAsia="ＭＳ ゴシック" w:cs="" w:asciiTheme="majorHAnsi" w:cstheme="majorBidi" w:eastAsiaTheme="majorEastAsia" w:hAnsiTheme="majorHAnsi"/>
+      <w:rFonts w:ascii="Calibri" w:hAnsi="Calibri" w:eastAsia="" w:cs="" w:asciiTheme="majorHAnsi" w:cstheme="majorBidi" w:eastAsiaTheme="majorEastAsia" w:hAnsiTheme="majorHAnsi"/>
       <w:b/>
       <w:bCs/>
       <w:color w:themeColor="accent1" w:themeShade="bf" w:val="365F91"/>
@@ -2963,7 +2989,7 @@
     <w:qFormat/>
     <w:rsid w:val="00fc693f"/>
     <w:rPr>
-      <w:rFonts w:ascii="Calibri" w:hAnsi="Calibri" w:eastAsia="ＭＳ ゴシック" w:cs="" w:asciiTheme="majorHAnsi" w:cstheme="majorBidi" w:eastAsiaTheme="majorEastAsia" w:hAnsiTheme="majorHAnsi"/>
+      <w:rFonts w:ascii="Calibri" w:hAnsi="Calibri" w:eastAsia="" w:cs="" w:asciiTheme="majorHAnsi" w:cstheme="majorBidi" w:eastAsiaTheme="majorEastAsia" w:hAnsiTheme="majorHAnsi"/>
       <w:b/>
       <w:bCs/>
       <w:color w:themeColor="accent1" w:val="4F81BD"/>
@@ -2979,7 +3005,7 @@
     <w:qFormat/>
     <w:rsid w:val="00fc693f"/>
     <w:rPr>
-      <w:rFonts w:ascii="Calibri" w:hAnsi="Calibri" w:eastAsia="ＭＳ ゴシック" w:cs="" w:asciiTheme="majorHAnsi" w:cstheme="majorBidi" w:eastAsiaTheme="majorEastAsia" w:hAnsiTheme="majorHAnsi"/>
+      <w:rFonts w:ascii="Calibri" w:hAnsi="Calibri" w:eastAsia="" w:cs="" w:asciiTheme="majorHAnsi" w:cstheme="majorBidi" w:eastAsiaTheme="majorEastAsia" w:hAnsiTheme="majorHAnsi"/>
       <w:b/>
       <w:bCs/>
       <w:color w:themeColor="accent1" w:val="4F81BD"/>
@@ -2993,7 +3019,7 @@
     <w:qFormat/>
     <w:rsid w:val="00fc693f"/>
     <w:rPr>
-      <w:rFonts w:ascii="Calibri" w:hAnsi="Calibri" w:eastAsia="ＭＳ ゴシック" w:cs="" w:asciiTheme="majorHAnsi" w:cstheme="majorBidi" w:eastAsiaTheme="majorEastAsia" w:hAnsiTheme="majorHAnsi"/>
+      <w:rFonts w:ascii="Calibri" w:hAnsi="Calibri" w:eastAsia="" w:cs="" w:asciiTheme="majorHAnsi" w:cstheme="majorBidi" w:eastAsiaTheme="majorEastAsia" w:hAnsiTheme="majorHAnsi"/>
       <w:color w:themeColor="text2" w:themeShade="bf" w:val="17365D"/>
       <w:spacing w:val="5"/>
       <w:kern w:val="2"/>
@@ -3009,7 +3035,7 @@
     <w:qFormat/>
     <w:rsid w:val="00fc693f"/>
     <w:rPr>
-      <w:rFonts w:ascii="Calibri" w:hAnsi="Calibri" w:eastAsia="ＭＳ ゴシック" w:cs="" w:asciiTheme="majorHAnsi" w:cstheme="majorBidi" w:eastAsiaTheme="majorEastAsia" w:hAnsiTheme="majorHAnsi"/>
+      <w:rFonts w:ascii="Calibri" w:hAnsi="Calibri" w:eastAsia="" w:cs="" w:asciiTheme="majorHAnsi" w:cstheme="majorBidi" w:eastAsiaTheme="majorEastAsia" w:hAnsiTheme="majorHAnsi"/>
       <w:i/>
       <w:iCs/>
       <w:color w:themeColor="accent1" w:val="4F81BD"/>
@@ -3082,7 +3108,7 @@
     <w:qFormat/>
     <w:rsid w:val="00fc693f"/>
     <w:rPr>
-      <w:rFonts w:ascii="Calibri" w:hAnsi="Calibri" w:eastAsia="ＭＳ ゴシック" w:cs="" w:asciiTheme="majorHAnsi" w:cstheme="majorBidi" w:eastAsiaTheme="majorEastAsia" w:hAnsiTheme="majorHAnsi"/>
+      <w:rFonts w:ascii="Calibri" w:hAnsi="Calibri" w:eastAsia="" w:cs="" w:asciiTheme="majorHAnsi" w:cstheme="majorBidi" w:eastAsiaTheme="majorEastAsia" w:hAnsiTheme="majorHAnsi"/>
       <w:b/>
       <w:bCs/>
       <w:i/>
@@ -3099,7 +3125,7 @@
     <w:qFormat/>
     <w:rsid w:val="00fc693f"/>
     <w:rPr>
-      <w:rFonts w:ascii="Calibri" w:hAnsi="Calibri" w:eastAsia="ＭＳ ゴシック" w:cs="" w:asciiTheme="majorHAnsi" w:cstheme="majorBidi" w:eastAsiaTheme="majorEastAsia" w:hAnsiTheme="majorHAnsi"/>
+      <w:rFonts w:ascii="Calibri" w:hAnsi="Calibri" w:eastAsia="" w:cs="" w:asciiTheme="majorHAnsi" w:cstheme="majorBidi" w:eastAsiaTheme="majorEastAsia" w:hAnsiTheme="majorHAnsi"/>
       <w:color w:themeColor="accent1" w:themeShade="7f" w:val="243F60"/>
     </w:rPr>
   </w:style>
@@ -3112,7 +3138,7 @@
     <w:qFormat/>
     <w:rsid w:val="00fc693f"/>
     <w:rPr>
-      <w:rFonts w:ascii="Calibri" w:hAnsi="Calibri" w:eastAsia="ＭＳ ゴシック" w:cs="" w:asciiTheme="majorHAnsi" w:cstheme="majorBidi" w:eastAsiaTheme="majorEastAsia" w:hAnsiTheme="majorHAnsi"/>
+      <w:rFonts w:ascii="Calibri" w:hAnsi="Calibri" w:eastAsia="" w:cs="" w:asciiTheme="majorHAnsi" w:cstheme="majorBidi" w:eastAsiaTheme="majorEastAsia" w:hAnsiTheme="majorHAnsi"/>
       <w:i/>
       <w:iCs/>
       <w:color w:themeColor="accent1" w:themeShade="7f" w:val="243F60"/>
@@ -3127,7 +3153,7 @@
     <w:qFormat/>
     <w:rsid w:val="00fc693f"/>
     <w:rPr>
-      <w:rFonts w:ascii="Calibri" w:hAnsi="Calibri" w:eastAsia="ＭＳ ゴシック" w:cs="" w:asciiTheme="majorHAnsi" w:cstheme="majorBidi" w:eastAsiaTheme="majorEastAsia" w:hAnsiTheme="majorHAnsi"/>
+      <w:rFonts w:ascii="Calibri" w:hAnsi="Calibri" w:eastAsia="" w:cs="" w:asciiTheme="majorHAnsi" w:cstheme="majorBidi" w:eastAsiaTheme="majorEastAsia" w:hAnsiTheme="majorHAnsi"/>
       <w:i/>
       <w:iCs/>
       <w:color w:themeColor="text1" w:themeTint="bf" w:val="404040"/>
@@ -3142,7 +3168,7 @@
     <w:qFormat/>
     <w:rsid w:val="00fc693f"/>
     <w:rPr>
-      <w:rFonts w:ascii="Calibri" w:hAnsi="Calibri" w:eastAsia="ＭＳ ゴシック" w:cs="" w:asciiTheme="majorHAnsi" w:cstheme="majorBidi" w:eastAsiaTheme="majorEastAsia" w:hAnsiTheme="majorHAnsi"/>
+      <w:rFonts w:ascii="Calibri" w:hAnsi="Calibri" w:eastAsia="" w:cs="" w:asciiTheme="majorHAnsi" w:cstheme="majorBidi" w:eastAsiaTheme="majorEastAsia" w:hAnsiTheme="majorHAnsi"/>
       <w:color w:themeColor="accent1" w:val="4F81BD"/>
       <w:sz w:val="20"/>
       <w:szCs w:val="20"/>
@@ -3157,7 +3183,7 @@
     <w:qFormat/>
     <w:rsid w:val="00fc693f"/>
     <w:rPr>
-      <w:rFonts w:ascii="Calibri" w:hAnsi="Calibri" w:eastAsia="ＭＳ ゴシック" w:cs="" w:asciiTheme="majorHAnsi" w:cstheme="majorBidi" w:eastAsiaTheme="majorEastAsia" w:hAnsiTheme="majorHAnsi"/>
+      <w:rFonts w:ascii="Calibri" w:hAnsi="Calibri" w:eastAsia="" w:cs="" w:asciiTheme="majorHAnsi" w:cstheme="majorBidi" w:eastAsiaTheme="majorEastAsia" w:hAnsiTheme="majorHAnsi"/>
       <w:i/>
       <w:iCs/>
       <w:color w:themeColor="text1" w:themeTint="bf" w:val="404040"/>
@@ -3401,12 +3427,13 @@
     <w:rsid w:val="00fc693f"/>
     <w:pPr>
       <w:widowControl/>
+      <w:suppressAutoHyphens w:val="true"/>
       <w:bidi w:val="0"/>
       <w:spacing w:lineRule="auto" w:line="240" w:before="0" w:after="0"/>
       <w:jc w:val="left"/>
     </w:pPr>
     <w:rPr>
-      <w:rFonts w:ascii="Cambria" w:hAnsi="Cambria" w:eastAsia="ＭＳ 明朝" w:cs="" w:asciiTheme="minorHAnsi" w:cstheme="minorBidi" w:eastAsiaTheme="minorEastAsia" w:hAnsiTheme="minorHAnsi"/>
+      <w:rFonts w:ascii="Cambria" w:hAnsi="Cambria" w:eastAsia="" w:cs="" w:asciiTheme="minorHAnsi" w:cstheme="minorBidi" w:eastAsiaTheme="minorEastAsia" w:hAnsiTheme="minorHAnsi"/>
       <w:color w:val="auto"/>
       <w:kern w:val="0"/>
       <w:sz w:val="22"/>
@@ -3430,7 +3457,7 @@
       <w:contextualSpacing/>
     </w:pPr>
     <w:rPr>
-      <w:rFonts w:ascii="Calibri" w:hAnsi="Calibri" w:eastAsia="ＭＳ ゴシック" w:cs="" w:asciiTheme="majorHAnsi" w:cstheme="majorBidi" w:eastAsiaTheme="majorEastAsia" w:hAnsiTheme="majorHAnsi"/>
+      <w:rFonts w:ascii="Calibri" w:hAnsi="Calibri" w:eastAsia="" w:cs="" w:asciiTheme="majorHAnsi" w:cstheme="majorBidi" w:eastAsiaTheme="majorEastAsia" w:hAnsiTheme="majorHAnsi"/>
       <w:color w:themeColor="text2" w:themeShade="bf" w:val="17365D"/>
       <w:spacing w:val="5"/>
       <w:kern w:val="2"/>
@@ -3448,7 +3475,7 @@
     <w:rsid w:val="00fc693f"/>
     <w:pPr/>
     <w:rPr>
-      <w:rFonts w:ascii="Calibri" w:hAnsi="Calibri" w:eastAsia="ＭＳ ゴシック" w:cs="" w:asciiTheme="majorHAnsi" w:cstheme="majorBidi" w:eastAsiaTheme="majorEastAsia" w:hAnsiTheme="majorHAnsi"/>
+      <w:rFonts w:ascii="Calibri" w:hAnsi="Calibri" w:eastAsia="" w:cs="" w:asciiTheme="majorHAnsi" w:cstheme="majorBidi" w:eastAsiaTheme="majorEastAsia" w:hAnsiTheme="majorHAnsi"/>
       <w:i/>
       <w:iCs/>
       <w:color w:themeColor="accent1" w:val="4F81BD"/>
@@ -3681,12 +3708,13 @@
         <w:tab w:val="left" w:pos="3456" w:leader="none"/>
         <w:tab w:val="left" w:pos="4032" w:leader="none"/>
       </w:tabs>
+      <w:suppressAutoHyphens w:val="true"/>
       <w:bidi w:val="0"/>
       <w:spacing w:lineRule="auto" w:line="276" w:before="0" w:after="200"/>
       <w:jc w:val="left"/>
     </w:pPr>
     <w:rPr>
-      <w:rFonts w:ascii="Courier" w:hAnsi="Courier" w:eastAsia="ＭＳ 明朝" w:cs="" w:cstheme="minorBidi" w:eastAsiaTheme="minorEastAsia"/>
+      <w:rFonts w:ascii="Courier" w:hAnsi="Courier" w:eastAsia="" w:cs="" w:cstheme="minorBidi" w:eastAsiaTheme="minorEastAsia"/>
       <w:color w:val="auto"/>
       <w:kern w:val="0"/>
       <w:sz w:val="20"/>
@@ -6884,7 +6912,6 @@
       <w:pPr>
         <w:spacing w:before="0" w:after="0" w:line="240" w:lineRule="auto"/>
       </w:pPr>
-      <w:rPr/>
       <w:tblPr/>
       <w:tcPr>
         <w:tcBorders>
@@ -7030,7 +7057,6 @@
       <w:pPr>
         <w:spacing w:before="0" w:after="0" w:line="240" w:lineRule="auto"/>
       </w:pPr>
-      <w:rPr/>
       <w:tblPr/>
       <w:tcPr>
         <w:tcBorders>
@@ -7176,7 +7202,6 @@
       <w:pPr>
         <w:spacing w:before="0" w:after="0" w:line="240" w:lineRule="auto"/>
       </w:pPr>
-      <w:rPr/>
       <w:tblPr/>
       <w:tcPr>
         <w:tcBorders>
@@ -7322,7 +7347,6 @@
       <w:pPr>
         <w:spacing w:before="0" w:after="0" w:line="240" w:lineRule="auto"/>
       </w:pPr>
-      <w:rPr/>
       <w:tblPr/>
       <w:tcPr>
         <w:tcBorders>
@@ -7468,7 +7492,6 @@
       <w:pPr>
         <w:spacing w:before="0" w:after="0" w:line="240" w:lineRule="auto"/>
       </w:pPr>
-      <w:rPr/>
       <w:tblPr/>
       <w:tcPr>
         <w:tcBorders>
@@ -7614,7 +7637,6 @@
       <w:pPr>
         <w:spacing w:before="0" w:after="0" w:line="240" w:lineRule="auto"/>
       </w:pPr>
-      <w:rPr/>
       <w:tblPr/>
       <w:tcPr>
         <w:tcBorders>
@@ -7760,7 +7782,6 @@
       <w:pPr>
         <w:spacing w:before="0" w:after="0" w:line="240" w:lineRule="auto"/>
       </w:pPr>
-      <w:rPr/>
       <w:tblPr/>
       <w:tcPr>
         <w:tcBorders>

</xml_diff>

<commit_message>
update resume and projects
</commit_message>
<xml_diff>
--- a/resume.docx
+++ b/resume.docx
@@ -171,7 +171,22 @@
           <w:szCs w:val="24"/>
           <w:u w:val="none"/>
         </w:rPr>
-        <w:t>Next.js, OpenAI</w:t>
+        <w:t xml:space="preserve">Next.js, OpenAI </w:t>
+      </w:r>
+      <w:r>
+        <w:rPr>
+          <w:rStyle w:val="Hyperlink"/>
+          <w:rFonts w:cs="Times New Roman" w:ascii="Times New Roman" w:hAnsi="Times New Roman"/>
+          <w:b/>
+          <w:bCs/>
+          <w:i w:val="false"/>
+          <w:iCs w:val="false"/>
+          <w:color w:val="auto"/>
+          <w:sz w:val="24"/>
+          <w:szCs w:val="24"/>
+          <w:u w:val="none"/>
+        </w:rPr>
+        <w:t>SDK</w:t>
       </w:r>
       <w:r>
         <w:rPr>
@@ -200,9 +215,24 @@
           <w:szCs w:val="24"/>
           <w:u w:val="none"/>
         </w:rPr>
-        <w:t>LangGraph, Postgres</w:t>
+        <w:t xml:space="preserve">LangGraph, </w:t>
       </w:r>
       <w:bookmarkEnd w:id="2"/>
+      <w:r>
+        <w:rPr>
+          <w:rStyle w:val="Hyperlink"/>
+          <w:rFonts w:cs="Times New Roman" w:ascii="Times New Roman" w:hAnsi="Times New Roman"/>
+          <w:b/>
+          <w:bCs/>
+          <w:i w:val="false"/>
+          <w:iCs w:val="false"/>
+          <w:color w:val="auto"/>
+          <w:sz w:val="24"/>
+          <w:szCs w:val="24"/>
+          <w:u w:val="none"/>
+        </w:rPr>
+        <w:t>Supabase, Vercel</w:t>
+      </w:r>
       <w:r>
         <w:rPr>
           <w:rFonts w:ascii="Times New Roman" w:hAnsi="Times New Roman"/>
@@ -371,7 +401,37 @@
           <w:szCs w:val="24"/>
           <w:u w:val="none"/>
         </w:rPr>
-        <w:t>, OpenAI,</w:t>
+        <w:t xml:space="preserve">, OpenAI </w:t>
+      </w:r>
+      <w:r>
+        <w:rPr>
+          <w:rStyle w:val="Hyperlink"/>
+          <w:rFonts w:cs="Times New Roman" w:ascii="Times New Roman" w:hAnsi="Times New Roman"/>
+          <w:b/>
+          <w:bCs/>
+          <w:i w:val="false"/>
+          <w:iCs w:val="false"/>
+          <w:color w:val="auto"/>
+          <w:sz w:val="24"/>
+          <w:szCs w:val="24"/>
+          <w:u w:val="none"/>
+        </w:rPr>
+        <w:t>SDK</w:t>
+      </w:r>
+      <w:r>
+        <w:rPr>
+          <w:rStyle w:val="Hyperlink"/>
+          <w:rFonts w:cs="Times New Roman" w:ascii="Times New Roman" w:hAnsi="Times New Roman"/>
+          <w:b/>
+          <w:bCs/>
+          <w:i w:val="false"/>
+          <w:iCs w:val="false"/>
+          <w:color w:val="auto"/>
+          <w:sz w:val="24"/>
+          <w:szCs w:val="24"/>
+          <w:u w:val="none"/>
+        </w:rPr>
+        <w:t>,</w:t>
       </w:r>
       <w:r>
         <w:rPr>
@@ -1111,7 +1171,49 @@
           <w:sz w:val="24"/>
           <w:szCs w:val="24"/>
         </w:rPr>
-        <w:t>.NET (C#), Vue, Typescript, PostgreSQL, Microservices, Redis, Kubernetes.</w:t>
+        <w:t>.NET (C#), Vue, Typescript, Postgre</w:t>
+      </w:r>
+      <w:r>
+        <w:rPr>
+          <w:rStyle w:val="Strong"/>
+          <w:rFonts w:cs="Times New Roman" w:ascii="Times New Roman" w:hAnsi="Times New Roman"/>
+          <w:color w:val="auto"/>
+          <w:sz w:val="24"/>
+          <w:szCs w:val="24"/>
+        </w:rPr>
+        <w:t>s</w:t>
+      </w:r>
+      <w:r>
+        <w:rPr>
+          <w:rStyle w:val="Strong"/>
+          <w:rFonts w:cs="Times New Roman" w:ascii="Times New Roman" w:hAnsi="Times New Roman"/>
+          <w:color w:val="auto"/>
+          <w:sz w:val="24"/>
+          <w:szCs w:val="24"/>
+        </w:rPr>
+        <w:t>, Microservices</w:t>
+      </w:r>
+      <w:bookmarkStart w:id="9" w:name="__DdeLink__159_1676980460"/>
+      <w:r>
+        <w:rPr>
+          <w:rStyle w:val="Strong"/>
+          <w:rFonts w:cs="Times New Roman" w:ascii="Times New Roman" w:hAnsi="Times New Roman"/>
+          <w:color w:val="auto"/>
+          <w:sz w:val="24"/>
+          <w:szCs w:val="24"/>
+        </w:rPr>
+        <w:t>, Redis</w:t>
+      </w:r>
+      <w:bookmarkEnd w:id="9"/>
+      <w:r>
+        <w:rPr>
+          <w:rStyle w:val="Strong"/>
+          <w:rFonts w:cs="Times New Roman" w:ascii="Times New Roman" w:hAnsi="Times New Roman"/>
+          <w:color w:val="auto"/>
+          <w:sz w:val="24"/>
+          <w:szCs w:val="24"/>
+        </w:rPr>
+        <w:t>, Kubernetes.</w:t>
       </w:r>
     </w:p>
     <w:p>
@@ -1245,7 +1347,44 @@
           <w:sz w:val="24"/>
           <w:szCs w:val="24"/>
         </w:rPr>
-        <w:t xml:space="preserve"> during COVID-19 in Ho Chi Minh City.</w:t>
+        <w:t xml:space="preserve"> during COVID-19 in Ho Chi Minh City </w:t>
+      </w:r>
+      <w:r>
+        <w:rPr>
+          <w:rFonts w:cs="Times New Roman" w:ascii="Times New Roman" w:hAnsi="Times New Roman"/>
+          <w:color w:val="auto"/>
+          <w:sz w:val="24"/>
+          <w:szCs w:val="24"/>
+        </w:rPr>
+        <w:t>using</w:t>
+      </w:r>
+      <w:r>
+        <w:rPr>
+          <w:rFonts w:cs="Times New Roman" w:ascii="Times New Roman" w:hAnsi="Times New Roman"/>
+          <w:color w:val="auto"/>
+          <w:sz w:val="24"/>
+          <w:szCs w:val="24"/>
+        </w:rPr>
+        <w:t xml:space="preserve"> </w:t>
+      </w:r>
+      <w:r>
+        <w:rPr>
+          <w:rStyle w:val="Strong"/>
+          <w:rFonts w:cs="Times New Roman" w:ascii="Times New Roman" w:hAnsi="Times New Roman"/>
+          <w:color w:val="auto"/>
+          <w:sz w:val="24"/>
+          <w:szCs w:val="24"/>
+        </w:rPr>
+        <w:t>NestJS, MongoDB, React, Typescript</w:t>
+      </w:r>
+      <w:r>
+        <w:rPr>
+          <w:rFonts w:cs="Times New Roman" w:ascii="Times New Roman" w:hAnsi="Times New Roman"/>
+          <w:color w:val="auto"/>
+          <w:sz w:val="24"/>
+          <w:szCs w:val="24"/>
+        </w:rPr>
+        <w:t>.</w:t>
       </w:r>
     </w:p>
     <w:p>
@@ -1431,6 +1570,7 @@
           <w:szCs w:val="24"/>
         </w:rPr>
       </w:pPr>
+      <w:bookmarkEnd w:id="0"/>
       <w:r>
         <w:rPr>
           <w:rFonts w:eastAsia="Calibri" w:cs="Times New Roman" w:ascii="Times New Roman" w:hAnsi="Times New Roman"/>
@@ -1440,7 +1580,7 @@
           <w:sz w:val="24"/>
           <w:szCs w:val="24"/>
         </w:rPr>
-        <w:t>CI/CD Tools</w:t>
+        <w:t>Agent Framework</w:t>
       </w:r>
       <w:r>
         <w:rPr>
@@ -1449,7 +1589,7 @@
           <w:sz w:val="24"/>
           <w:szCs w:val="24"/>
         </w:rPr>
-        <w:t>: Git, Github Actions, Docker, Kubernetes, Ansible</w:t>
+        <w:t>: LangChain, LangGraph, OpenAI SDK</w:t>
       </w:r>
     </w:p>
     <w:p>
@@ -1469,21 +1609,14 @@
       </w:pPr>
       <w:r>
         <w:rPr>
-          <w:rFonts w:ascii="Times New Roman" w:hAnsi="Times New Roman"/>
+          <w:rFonts w:eastAsia="Calibri" w:cs="Times New Roman" w:ascii="Times New Roman" w:hAnsi="Times New Roman"/>
           <w:b/>
           <w:bCs/>
+          <w:kern w:val="0"/>
           <w:sz w:val="24"/>
           <w:szCs w:val="24"/>
         </w:rPr>
-        <w:t>AI Development</w:t>
-      </w:r>
-      <w:r>
-        <w:rPr>
-          <w:rFonts w:ascii="Times New Roman" w:hAnsi="Times New Roman"/>
-          <w:sz w:val="24"/>
-          <w:szCs w:val="24"/>
-        </w:rPr>
-        <w:t>: llama.cpp, vllm, Hugging Face</w:t>
+        <w:t>Coding Agent</w:t>
       </w:r>
       <w:r>
         <w:rPr>
@@ -1492,7 +1625,7 @@
           <w:sz w:val="24"/>
           <w:szCs w:val="24"/>
         </w:rPr>
-        <w:t>, Claude Code</w:t>
+        <w:t>: Claude Code, OpenAI Codex, Cursor, OpenCode, Lovable</w:t>
       </w:r>
     </w:p>
     <w:p>
@@ -1502,7 +1635,7 @@
           <w:ilvl w:val="0"/>
           <w:numId w:val="1"/>
         </w:numPr>
-        <w:spacing w:lineRule="auto" w:line="240" w:before="0" w:after="86"/>
+        <w:spacing w:lineRule="auto" w:line="240" w:before="0" w:after="115"/>
         <w:ind w:hanging="360" w:left="360"/>
         <w:rPr>
           <w:rFonts w:ascii="Times New Roman" w:hAnsi="Times New Roman"/>
@@ -1510,8 +1643,6 @@
           <w:szCs w:val="24"/>
         </w:rPr>
       </w:pPr>
-      <w:bookmarkStart w:id="9" w:name="__DdeLink__293_2421298475"/>
-      <w:bookmarkEnd w:id="0"/>
       <w:r>
         <w:rPr>
           <w:rFonts w:eastAsia="Calibri" w:cs="Times New Roman" w:ascii="Times New Roman" w:hAnsi="Times New Roman"/>
@@ -1530,9 +1661,8 @@
           <w:sz w:val="24"/>
           <w:szCs w:val="24"/>
         </w:rPr>
-        <w:t>: AWS EC2, ECS, Lambda, S3, CloudFront, RDS, DynamoDB</w:t>
+        <w:t>: AWS, Vercel, CloudFlare, Postgres (Supabase, Neon)</w:t>
       </w:r>
-      <w:bookmarkEnd w:id="9"/>
     </w:p>
     <w:p>
       <w:pPr>

</xml_diff>

<commit_message>
- new post - update resume
</commit_message>
<xml_diff>
--- a/resume.docx
+++ b/resume.docx
@@ -34,22 +34,6 @@
         <w:jc w:val="center"/>
         <w:rPr/>
       </w:pPr>
-      <w:r>
-        <w:rPr>
-          <w:rFonts w:cs="Times New Roman" w:ascii="Times New Roman" w:hAnsi="Times New Roman"/>
-          <w:sz w:val="24"/>
-          <w:szCs w:val="24"/>
-        </w:rPr>
-        <w:t>541-360-9231</w:t>
-      </w:r>
-      <w:r>
-        <w:rPr>
-          <w:rFonts w:ascii="Times New Roman" w:hAnsi="Times New Roman"/>
-          <w:sz w:val="24"/>
-          <w:szCs w:val="24"/>
-        </w:rPr>
-        <w:t xml:space="preserve"> | </w:t>
-      </w:r>
       <w:r>
         <w:rPr>
           <w:rFonts w:cs="Times New Roman" w:ascii="Times New Roman" w:hAnsi="Times New Roman"/>
@@ -298,7 +282,7 @@
           <w:sz w:val="24"/>
           <w:szCs w:val="24"/>
         </w:rPr>
-        <w:t xml:space="preserve"> to study future employers, draft personalized letters and LinkedIn messages to hiring personnel</w:t>
+        <w:t xml:space="preserve"> to </w:t>
       </w:r>
       <w:bookmarkEnd w:id="3"/>
       <w:r>
@@ -307,7 +291,23 @@
           <w:sz w:val="24"/>
           <w:szCs w:val="24"/>
         </w:rPr>
-        <w:t>.</w:t>
+        <w:t xml:space="preserve">research company information </w:t>
+      </w:r>
+      <w:r>
+        <w:rPr>
+          <w:rFonts w:ascii="Times New Roman" w:hAnsi="Times New Roman"/>
+          <w:sz w:val="24"/>
+          <w:szCs w:val="24"/>
+        </w:rPr>
+        <w:t>and</w:t>
+      </w:r>
+      <w:r>
+        <w:rPr>
+          <w:rFonts w:ascii="Times New Roman" w:hAnsi="Times New Roman"/>
+          <w:sz w:val="24"/>
+          <w:szCs w:val="24"/>
+        </w:rPr>
+        <w:t xml:space="preserve"> generate personalized cover letters and outreach messages to hiring personnel.</w:t>
       </w:r>
       <w:bookmarkEnd w:id="1"/>
     </w:p>
@@ -494,7 +494,7 @@
           <w:sz w:val="24"/>
           <w:szCs w:val="24"/>
         </w:rPr>
-        <w:t xml:space="preserve"> research assistant end-to-end to surface relevant insights from academic papers and interact with them through conversation.</w:t>
+        <w:t xml:space="preserve"> workspace, enabling multi-session collaboration that grounds its responses in verifiable source documents.</w:t>
       </w:r>
     </w:p>
     <w:p>
@@ -1497,18 +1497,7 @@
           <w:sz w:val="24"/>
           <w:szCs w:val="24"/>
         </w:rPr>
-        <w:t xml:space="preserve">AI </w:t>
-      </w:r>
-      <w:r>
-        <w:rPr>
-          <w:rFonts w:eastAsia="Calibri" w:cs="Times New Roman" w:ascii="Times New Roman" w:hAnsi="Times New Roman"/>
-          <w:b/>
-          <w:bCs/>
-          <w:kern w:val="0"/>
-          <w:sz w:val="24"/>
-          <w:szCs w:val="24"/>
-        </w:rPr>
-        <w:t>Agent Framework</w:t>
+        <w:t>AI Agent Framework</w:t>
       </w:r>
       <w:r>
         <w:rPr>

</xml_diff>